<commit_message>
:memo: Update Ethical Approval Form
Updated the Ethical Approval Form before the meeting with the supervisor
</commit_message>
<xml_diff>
--- a/docs/Ethical Approval Form.docx
+++ b/docs/Ethical Approval Form.docx
@@ -5816,7 +5816,135 @@
                 <w:bCs/>
                 <w:sz w:val="22"/>
                 <w:szCs w:val="22"/>
-                <w:lang w:val="en-US"/>
+                <w:lang w:val="en-IE"/>
+              </w:rPr>
+            </w:pPr>
+            <w:r>
+              <w:rPr>
+                <w:rFonts w:eastAsia="Calibri"/>
+                <w:bCs/>
+                <w:sz w:val="22"/>
+                <w:szCs w:val="22"/>
+                <w:lang w:val="en-IE"/>
+              </w:rPr>
+              <w:t>This research project explores what makes a song popular and how these factors have changed over time. In simple terms, it looks at the characteristics of music</w:t>
+            </w:r>
+            <w:r>
+              <w:rPr>
+                <w:rFonts w:eastAsia="Calibri"/>
+                <w:bCs/>
+                <w:sz w:val="22"/>
+                <w:szCs w:val="22"/>
+                <w:lang w:val="en-IE"/>
+              </w:rPr>
+              <w:t xml:space="preserve"> - </w:t>
+            </w:r>
+            <w:r>
+              <w:rPr>
+                <w:rFonts w:eastAsia="Calibri"/>
+                <w:bCs/>
+                <w:sz w:val="22"/>
+                <w:szCs w:val="22"/>
+                <w:lang w:val="en-IE"/>
+              </w:rPr>
+              <w:t>such as tempo (speed), loudness, energy, and danceability</w:t>
+            </w:r>
+            <w:r>
+              <w:rPr>
+                <w:rFonts w:eastAsia="Calibri"/>
+                <w:bCs/>
+                <w:sz w:val="22"/>
+                <w:szCs w:val="22"/>
+                <w:lang w:val="en-IE"/>
+              </w:rPr>
+              <w:t xml:space="preserve"> - </w:t>
+            </w:r>
+            <w:r>
+              <w:rPr>
+                <w:rFonts w:eastAsia="Calibri"/>
+                <w:bCs/>
+                <w:sz w:val="22"/>
+                <w:szCs w:val="22"/>
+                <w:lang w:val="en-IE"/>
+              </w:rPr>
+              <w:t>and examines how these features relate to a song’s success with listeners.</w:t>
+            </w:r>
+          </w:p>
+          <w:p>
+            <w:pPr>
+              <w:spacing w:after="200" w:line="276" w:lineRule="auto"/>
+              <w:rPr>
+                <w:rFonts w:eastAsia="Calibri"/>
+                <w:bCs/>
+                <w:sz w:val="22"/>
+                <w:szCs w:val="22"/>
+                <w:lang w:val="en-IE"/>
+              </w:rPr>
+            </w:pPr>
+            <w:r>
+              <w:rPr>
+                <w:rFonts w:eastAsia="Calibri"/>
+                <w:bCs/>
+                <w:sz w:val="22"/>
+                <w:szCs w:val="22"/>
+                <w:lang w:val="en-IE"/>
+              </w:rPr>
+              <w:t>To do this, I will collect data from an online music database (using an API, which is a tool that allows programs to request data automatically). I will also gather information such as each song’s release date to understand how trends have evolved. The data will then be cleaned and filtered to ensure only relevant songs are included.</w:t>
+            </w:r>
+          </w:p>
+          <w:p>
+            <w:pPr>
+              <w:spacing w:after="200" w:line="276" w:lineRule="auto"/>
+              <w:rPr>
+                <w:rFonts w:eastAsia="Calibri"/>
+                <w:bCs/>
+                <w:sz w:val="22"/>
+                <w:szCs w:val="22"/>
+                <w:lang w:val="en-IE"/>
+              </w:rPr>
+            </w:pPr>
+            <w:r>
+              <w:rPr>
+                <w:rFonts w:eastAsia="Calibri"/>
+                <w:bCs/>
+                <w:sz w:val="22"/>
+                <w:szCs w:val="22"/>
+                <w:lang w:val="en-IE"/>
+              </w:rPr>
+              <w:t>Next, I will organise the information into a time series, which means tracking changes in musical features year by year. This allows me to identify patterns, such as whether popular songs have become faster, more energetic, or more danceable over time.</w:t>
+            </w:r>
+          </w:p>
+          <w:p>
+            <w:pPr>
+              <w:spacing w:after="200" w:line="276" w:lineRule="auto"/>
+              <w:rPr>
+                <w:rFonts w:eastAsia="Calibri"/>
+                <w:bCs/>
+                <w:sz w:val="22"/>
+                <w:szCs w:val="22"/>
+                <w:lang w:val="en-IE"/>
+              </w:rPr>
+            </w:pPr>
+            <w:r>
+              <w:rPr>
+                <w:rFonts w:eastAsia="Calibri"/>
+                <w:bCs/>
+                <w:sz w:val="22"/>
+                <w:szCs w:val="22"/>
+                <w:lang w:val="en-IE"/>
+              </w:rPr>
+              <w:t>Participants are not directly involved in this study, as it relies entirely on publicly available music data. The findings aim to provide insight into how musical trends shift and what elements contribute to a song’s popularity.</w:t>
+            </w:r>
+          </w:p>
+          <w:p>
+            <w:pPr>
+              <w:spacing w:after="200" w:line="276" w:lineRule="auto"/>
+              <w:rPr>
+                <w:rFonts w:eastAsia="Calibri"/>
+                <w:bCs/>
+                <w:sz w:val="22"/>
+                <w:szCs w:val="22"/>
+                <w:lang w:val="en-IE"/>
               </w:rPr>
             </w:pPr>
           </w:p>
@@ -5951,7 +6079,6 @@
           <w:sz w:val="22"/>
           <w:szCs w:val="22"/>
         </w:rPr>
-        <w:lastRenderedPageBreak/>
         <w:t>Research objectives (Maximum 150 words)</w:t>
       </w:r>
     </w:p>
@@ -6013,12 +6140,128 @@
             <w:pPr>
               <w:pStyle w:val="NormalWeb"/>
               <w:shd w:val="clear" w:color="auto" w:fill="FFFFFF"/>
+              <w:spacing w:line="276" w:lineRule="auto"/>
               <w:rPr>
                 <w:rFonts w:ascii="Arial" w:eastAsia="Calibri" w:hAnsi="Arial" w:cs="Arial"/>
                 <w:sz w:val="22"/>
                 <w:szCs w:val="22"/>
-              </w:rPr>
-            </w:pPr>
+                <w:lang w:val="en-IE"/>
+              </w:rPr>
+            </w:pPr>
+            <w:r>
+              <w:rPr>
+                <w:rFonts w:ascii="Arial" w:eastAsia="Calibri" w:hAnsi="Arial" w:cs="Arial"/>
+                <w:sz w:val="22"/>
+                <w:szCs w:val="22"/>
+                <w:lang w:val="en-IE"/>
+              </w:rPr>
+              <w:t>The main objective of this research is to identify the key musical features that contribute to song popularity in contemporary music. It aims to analyse attributes such as tempo, energy, loudness, and danceability to determine how strongly they are associated with successful songs.</w:t>
+            </w:r>
+          </w:p>
+          <w:p>
+            <w:pPr>
+              <w:pStyle w:val="NormalWeb"/>
+              <w:shd w:val="clear" w:color="auto" w:fill="FFFFFF"/>
+              <w:spacing w:line="276" w:lineRule="auto"/>
+              <w:rPr>
+                <w:rFonts w:ascii="Arial" w:eastAsia="Calibri" w:hAnsi="Arial" w:cs="Arial"/>
+                <w:sz w:val="22"/>
+                <w:szCs w:val="22"/>
+                <w:lang w:val="en-IE"/>
+              </w:rPr>
+            </w:pPr>
+          </w:p>
+          <w:p>
+            <w:pPr>
+              <w:pStyle w:val="NormalWeb"/>
+              <w:shd w:val="clear" w:color="auto" w:fill="FFFFFF"/>
+              <w:spacing w:line="276" w:lineRule="auto"/>
+              <w:rPr>
+                <w:rFonts w:ascii="Arial" w:eastAsia="Calibri" w:hAnsi="Arial" w:cs="Arial"/>
+                <w:sz w:val="22"/>
+                <w:szCs w:val="22"/>
+                <w:lang w:val="en-IE"/>
+              </w:rPr>
+            </w:pPr>
+            <w:r>
+              <w:rPr>
+                <w:rFonts w:ascii="Arial" w:eastAsia="Calibri" w:hAnsi="Arial" w:cs="Arial"/>
+                <w:sz w:val="22"/>
+                <w:szCs w:val="22"/>
+                <w:lang w:val="en-IE"/>
+              </w:rPr>
+              <w:t>A further objective is to examine how these relationships have changed over time. By constructing a time series dataset of songs and their features, the study will track trends and identify shifts in what makes music popular across different periods.</w:t>
+            </w:r>
+          </w:p>
+          <w:p>
+            <w:pPr>
+              <w:pStyle w:val="NormalWeb"/>
+              <w:shd w:val="clear" w:color="auto" w:fill="FFFFFF"/>
+              <w:spacing w:line="276" w:lineRule="auto"/>
+              <w:rPr>
+                <w:rFonts w:ascii="Arial" w:eastAsia="Calibri" w:hAnsi="Arial" w:cs="Arial"/>
+                <w:sz w:val="22"/>
+                <w:szCs w:val="22"/>
+                <w:lang w:val="en-IE"/>
+              </w:rPr>
+            </w:pPr>
+          </w:p>
+          <w:p>
+            <w:pPr>
+              <w:pStyle w:val="NormalWeb"/>
+              <w:shd w:val="clear" w:color="auto" w:fill="FFFFFF"/>
+              <w:spacing w:line="276" w:lineRule="auto"/>
+              <w:rPr>
+                <w:rFonts w:ascii="Arial" w:eastAsia="Calibri" w:hAnsi="Arial" w:cs="Arial"/>
+                <w:sz w:val="22"/>
+                <w:szCs w:val="22"/>
+                <w:lang w:val="en-IE"/>
+              </w:rPr>
+            </w:pPr>
+            <w:r>
+              <w:rPr>
+                <w:rFonts w:ascii="Arial" w:eastAsia="Calibri" w:hAnsi="Arial" w:cs="Arial"/>
+                <w:sz w:val="22"/>
+                <w:szCs w:val="22"/>
+                <w:lang w:val="en-IE"/>
+              </w:rPr>
+              <w:t>The research also seeks to develop a structured dataset by collecting and cleaning data from a music API and supplementary sources, including release dates. This ensures reliable analysis of long-term trends.</w:t>
+            </w:r>
+          </w:p>
+          <w:p>
+            <w:pPr>
+              <w:pStyle w:val="NormalWeb"/>
+              <w:shd w:val="clear" w:color="auto" w:fill="FFFFFF"/>
+              <w:spacing w:line="276" w:lineRule="auto"/>
+              <w:rPr>
+                <w:rFonts w:ascii="Arial" w:eastAsia="Calibri" w:hAnsi="Arial" w:cs="Arial"/>
+                <w:sz w:val="22"/>
+                <w:szCs w:val="22"/>
+                <w:lang w:val="en-IE"/>
+              </w:rPr>
+            </w:pPr>
+          </w:p>
+          <w:p>
+            <w:pPr>
+              <w:pStyle w:val="NormalWeb"/>
+              <w:shd w:val="clear" w:color="auto" w:fill="FFFFFF"/>
+              <w:spacing w:line="276" w:lineRule="auto"/>
+              <w:rPr>
+                <w:rFonts w:ascii="Arial" w:eastAsia="Calibri" w:hAnsi="Arial" w:cs="Arial"/>
+                <w:sz w:val="22"/>
+                <w:szCs w:val="22"/>
+                <w:lang w:val="en-IE"/>
+              </w:rPr>
+            </w:pPr>
+            <w:r>
+              <w:rPr>
+                <w:rFonts w:ascii="Arial" w:eastAsia="Calibri" w:hAnsi="Arial" w:cs="Arial"/>
+                <w:sz w:val="22"/>
+                <w:szCs w:val="22"/>
+                <w:lang w:val="en-IE"/>
+              </w:rPr>
+              <w:t>Ultimately, the study aims to provide a clearer understanding of evolving musical preferences and the structural factors that influence popularity in the modern music industry.</w:t>
+            </w:r>
           </w:p>
           <w:p>
             <w:pPr>
@@ -6246,6 +6489,7 @@
                 <w:szCs w:val="22"/>
                 <w:lang w:val="en-US"/>
               </w:rPr>
+              <w:lastRenderedPageBreak/>
               <w:t>Research start date</w:t>
             </w:r>
           </w:p>
@@ -6320,25 +6564,41 @@
                 <w:lang w:val="en-US"/>
               </w:rPr>
             </w:pPr>
-            <w:proofErr w:type="gramStart"/>
-            <w:r>
-              <w:rPr>
-                <w:rFonts w:eastAsia="Calibri"/>
-                <w:sz w:val="22"/>
-                <w:szCs w:val="22"/>
-                <w:lang w:val="en-US"/>
-              </w:rPr>
-              <w:t>?/</w:t>
-            </w:r>
-            <w:proofErr w:type="gramEnd"/>
-            <w:r>
-              <w:rPr>
-                <w:rFonts w:eastAsia="Calibri"/>
-                <w:sz w:val="22"/>
-                <w:szCs w:val="22"/>
-                <w:lang w:val="en-US"/>
-              </w:rPr>
-              <w:t>08/2026</w:t>
+            <w:r>
+              <w:rPr>
+                <w:rFonts w:eastAsia="Calibri"/>
+                <w:sz w:val="22"/>
+                <w:szCs w:val="22"/>
+                <w:lang w:val="en-US"/>
+              </w:rPr>
+              <w:t>01</w:t>
+            </w:r>
+            <w:r>
+              <w:rPr>
+                <w:rFonts w:eastAsia="Calibri"/>
+                <w:sz w:val="22"/>
+                <w:szCs w:val="22"/>
+                <w:lang w:val="en-US"/>
+              </w:rPr>
+              <w:t>/0</w:t>
+            </w:r>
+            <w:r>
+              <w:rPr>
+                <w:rFonts w:eastAsia="Calibri"/>
+                <w:sz w:val="22"/>
+                <w:szCs w:val="22"/>
+                <w:lang w:val="en-US"/>
+              </w:rPr>
+              <w:t>9</w:t>
+            </w:r>
+            <w:r>
+              <w:rPr>
+                <w:rFonts w:eastAsia="Calibri"/>
+                <w:sz w:val="22"/>
+                <w:szCs w:val="22"/>
+                <w:lang w:val="en-US"/>
+              </w:rPr>
+              <w:t>/2026</w:t>
             </w:r>
           </w:p>
         </w:tc>
@@ -7340,7 +7600,6 @@
           <w:sz w:val="28"/>
           <w:szCs w:val="28"/>
         </w:rPr>
-        <w:lastRenderedPageBreak/>
         <w:t xml:space="preserve">3.4 Sample </w:t>
       </w:r>
       <w:r>
@@ -7791,7 +8050,19 @@
                 <w:szCs w:val="22"/>
                 <w:lang w:val="en-US"/>
               </w:rPr>
-              <w:t>Justification for proposed sample size and for selecting a specific gender, age, or any other group if this is done in your research.</w:t>
+              <w:t xml:space="preserve">Justification for proposed sample size and for selecting a specific gender, age, or any </w:t>
+            </w:r>
+            <w:r>
+              <w:rPr>
+                <w:rFonts w:eastAsia="Calibri"/>
+                <w:b/>
+                <w:bCs/>
+                <w:sz w:val="22"/>
+                <w:szCs w:val="22"/>
+                <w:lang w:val="en-US"/>
+              </w:rPr>
+              <w:lastRenderedPageBreak/>
+              <w:t>other group if this is done in your research.</w:t>
             </w:r>
           </w:p>
           <w:p>
@@ -8454,19 +8725,7 @@
                 <w:szCs w:val="22"/>
                 <w:lang w:val="en-US"/>
               </w:rPr>
-              <w:t xml:space="preserve">With questionnaires, will you give participants the option of </w:t>
-            </w:r>
-            <w:r>
-              <w:rPr>
-                <w:rFonts w:eastAsia="Calibri"/>
-                <w:b/>
-                <w:bCs/>
-                <w:sz w:val="22"/>
-                <w:szCs w:val="22"/>
-                <w:lang w:val="en-US"/>
-              </w:rPr>
-              <w:lastRenderedPageBreak/>
-              <w:t>omitting questions they do not want to answer?</w:t>
+              <w:t>With questionnaires, will you give participants the option of omitting questions they do not want to answer?</w:t>
             </w:r>
           </w:p>
         </w:tc>
@@ -9142,12 +9401,22 @@
               <w:spacing w:after="200" w:line="276" w:lineRule="auto"/>
               <w:rPr>
                 <w:rFonts w:eastAsia="Calibri"/>
-                <w:b/>
-                <w:sz w:val="22"/>
-                <w:szCs w:val="22"/>
-                <w:lang w:val="en-US"/>
-              </w:rPr>
-            </w:pPr>
+                <w:bCs/>
+                <w:sz w:val="22"/>
+                <w:szCs w:val="22"/>
+                <w:lang w:val="en-US"/>
+              </w:rPr>
+            </w:pPr>
+            <w:r>
+              <w:rPr>
+                <w:rFonts w:eastAsia="Calibri"/>
+                <w:bCs/>
+                <w:sz w:val="22"/>
+                <w:szCs w:val="22"/>
+                <w:lang w:val="en-US"/>
+              </w:rPr>
+              <w:t>The dataset I will use in the project is publicly available online. No personal information will be stored.</w:t>
+            </w:r>
           </w:p>
           <w:p>
             <w:pPr>
@@ -9267,6 +9536,23 @@
                 <w:sz w:val="22"/>
                 <w:szCs w:val="22"/>
               </w:rPr>
+              <w:t>N/A</w:t>
+            </w:r>
+          </w:p>
+          <w:p>
+            <w:pPr>
+              <w:rPr>
+                <w:rFonts w:eastAsia="Calibri"/>
+                <w:sz w:val="22"/>
+                <w:szCs w:val="22"/>
+              </w:rPr>
+            </w:pPr>
+            <w:r>
+              <w:rPr>
+                <w:rFonts w:eastAsia="Calibri"/>
+                <w:sz w:val="22"/>
+                <w:szCs w:val="22"/>
+              </w:rPr>
               <w:t> </w:t>
             </w:r>
           </w:p>
@@ -9305,6 +9591,23 @@
                 <w:sz w:val="22"/>
                 <w:szCs w:val="22"/>
               </w:rPr>
+              <w:t>N/A</w:t>
+            </w:r>
+          </w:p>
+          <w:p>
+            <w:pPr>
+              <w:rPr>
+                <w:rFonts w:eastAsia="Calibri"/>
+                <w:sz w:val="22"/>
+                <w:szCs w:val="22"/>
+              </w:rPr>
+            </w:pPr>
+            <w:r>
+              <w:rPr>
+                <w:rFonts w:eastAsia="Calibri"/>
+                <w:sz w:val="22"/>
+                <w:szCs w:val="22"/>
+              </w:rPr>
               <w:t> </w:t>
             </w:r>
           </w:p>
@@ -9343,6 +9646,23 @@
                 <w:sz w:val="22"/>
                 <w:szCs w:val="22"/>
               </w:rPr>
+              <w:t>N/A</w:t>
+            </w:r>
+          </w:p>
+          <w:p>
+            <w:pPr>
+              <w:rPr>
+                <w:rFonts w:eastAsia="Calibri"/>
+                <w:sz w:val="22"/>
+                <w:szCs w:val="22"/>
+              </w:rPr>
+            </w:pPr>
+            <w:r>
+              <w:rPr>
+                <w:rFonts w:eastAsia="Calibri"/>
+                <w:sz w:val="22"/>
+                <w:szCs w:val="22"/>
+              </w:rPr>
               <w:t> </w:t>
             </w:r>
           </w:p>
@@ -9381,6 +9701,23 @@
                 <w:sz w:val="22"/>
                 <w:szCs w:val="22"/>
               </w:rPr>
+              <w:t>N/A</w:t>
+            </w:r>
+          </w:p>
+          <w:p>
+            <w:pPr>
+              <w:rPr>
+                <w:rFonts w:eastAsia="Calibri"/>
+                <w:sz w:val="22"/>
+                <w:szCs w:val="22"/>
+              </w:rPr>
+            </w:pPr>
+            <w:r>
+              <w:rPr>
+                <w:rFonts w:eastAsia="Calibri"/>
+                <w:sz w:val="22"/>
+                <w:szCs w:val="22"/>
+              </w:rPr>
               <w:t> </w:t>
             </w:r>
           </w:p>
@@ -9402,24 +9739,50 @@
                 <w:sz w:val="22"/>
                 <w:szCs w:val="22"/>
               </w:rPr>
-              <w:t>5. Data maintenance</w:t>
-            </w:r>
-          </w:p>
-          <w:p>
-            <w:pPr>
-              <w:rPr>
-                <w:rFonts w:eastAsia="Calibri"/>
-                <w:sz w:val="22"/>
-                <w:szCs w:val="22"/>
-              </w:rPr>
-            </w:pPr>
-            <w:r>
-              <w:rPr>
-                <w:rFonts w:eastAsia="Calibri"/>
-                <w:sz w:val="22"/>
-                <w:szCs w:val="22"/>
-              </w:rPr>
-              <w:lastRenderedPageBreak/>
+              <w:t>5. Data maintenanc</w:t>
+            </w:r>
+            <w:r>
+              <w:rPr>
+                <w:rFonts w:eastAsia="Calibri"/>
+                <w:b/>
+                <w:bCs/>
+                <w:sz w:val="22"/>
+                <w:szCs w:val="22"/>
+              </w:rPr>
+              <w:t>e</w:t>
+            </w:r>
+          </w:p>
+          <w:p>
+            <w:pPr>
+              <w:rPr>
+                <w:rFonts w:eastAsia="Calibri"/>
+                <w:sz w:val="22"/>
+                <w:szCs w:val="22"/>
+              </w:rPr>
+            </w:pPr>
+            <w:r>
+              <w:rPr>
+                <w:rFonts w:eastAsia="Calibri"/>
+                <w:sz w:val="22"/>
+                <w:szCs w:val="22"/>
+              </w:rPr>
+              <w:t>N/A</w:t>
+            </w:r>
+          </w:p>
+          <w:p>
+            <w:pPr>
+              <w:rPr>
+                <w:rFonts w:eastAsia="Calibri"/>
+                <w:sz w:val="22"/>
+                <w:szCs w:val="22"/>
+              </w:rPr>
+            </w:pPr>
+            <w:r>
+              <w:rPr>
+                <w:rFonts w:eastAsia="Calibri"/>
+                <w:sz w:val="22"/>
+                <w:szCs w:val="22"/>
+              </w:rPr>
               <w:t> </w:t>
             </w:r>
           </w:p>
@@ -9747,21 +10110,7 @@
           <w:sz w:val="22"/>
           <w:szCs w:val="22"/>
         </w:rPr>
-        <w:t>____</w:t>
-      </w:r>
-      <w:r>
-        <w:rPr>
-          <w:sz w:val="22"/>
-          <w:szCs w:val="22"/>
-        </w:rPr>
-        <w:t>_</w:t>
-      </w:r>
-      <w:r>
-        <w:rPr>
-          <w:sz w:val="22"/>
-          <w:szCs w:val="22"/>
-        </w:rPr>
-        <w:t>_____</w:t>
+        <w:t>19/03/2026</w:t>
       </w:r>
     </w:p>
     <w:p>
@@ -13108,7 +13457,6 @@
   <w:style w:type="character" w:default="1" w:styleId="DefaultParagraphFont">
     <w:name w:val="Default Paragraph Font"/>
     <w:uiPriority w:val="1"/>
-    <w:semiHidden/>
     <w:unhideWhenUsed/>
   </w:style>
   <w:style w:type="table" w:default="1" w:styleId="TableNormal">
@@ -13675,12 +14023,19 @@
 </file>
 
 <file path=customXml/item1.xml><?xml version="1.0" encoding="utf-8"?>
-<p:properties xmlns:p="http://schemas.microsoft.com/office/2006/metadata/properties" xmlns:xsi="http://www.w3.org/2001/XMLSchema-instance" xmlns:pc="http://schemas.microsoft.com/office/infopath/2007/PartnerControls">
-  <documentManagement/>
-</p:properties>
+<b:Sources xmlns:b="http://schemas.openxmlformats.org/officeDocument/2006/bibliography" xmlns="http://schemas.openxmlformats.org/officeDocument/2006/bibliography" SelectedStyle="\APA.XSL" StyleName="APA"/>
 </file>
 
 <file path=customXml/item2.xml><?xml version="1.0" encoding="utf-8"?>
+<?mso-contentType ?>
+<FormTemplates xmlns="http://schemas.microsoft.com/sharepoint/v3/contenttype/forms">
+  <Display>DocumentLibraryForm</Display>
+  <Edit>DocumentLibraryForm</Edit>
+  <New>DocumentLibraryForm</New>
+</FormTemplates>
+</file>
+
+<file path=customXml/item3.xml><?xml version="1.0" encoding="utf-8"?>
 <ct:contentTypeSchema xmlns:ct="http://schemas.microsoft.com/office/2006/metadata/contentType" xmlns:ma="http://schemas.microsoft.com/office/2006/metadata/properties/metaAttributes" ct:_="" ma:_="" ma:contentTypeName="Document" ma:contentTypeID="0x0101004CD05093EB57E54DA4CB06967808EFDD" ma:contentTypeVersion="4" ma:contentTypeDescription="Create a new document." ma:contentTypeScope="" ma:versionID="a3a50f2396e0e7116fe64cdadd017aeb">
   <xsd:schema xmlns:xsd="http://www.w3.org/2001/XMLSchema" xmlns:xs="http://www.w3.org/2001/XMLSchema" xmlns:p="http://schemas.microsoft.com/office/2006/metadata/properties" xmlns:ns2="724a3cbd-d002-4cdc-a07b-b6dc0e392eff" targetNamespace="http://schemas.microsoft.com/office/2006/metadata/properties" ma:root="true" ma:fieldsID="7baef1b11b98f2b1c06c7aed963cd763" ns2:_="">
     <xsd:import namespace="724a3cbd-d002-4cdc-a07b-b6dc0e392eff"/>
@@ -13826,29 +14181,29 @@
 </ct:contentTypeSchema>
 </file>
 
-<file path=customXml/item3.xml><?xml version="1.0" encoding="utf-8"?>
-<?mso-contentType ?>
-<FormTemplates xmlns="http://schemas.microsoft.com/sharepoint/v3/contenttype/forms">
-  <Display>DocumentLibraryForm</Display>
-  <Edit>DocumentLibraryForm</Edit>
-  <New>DocumentLibraryForm</New>
-</FormTemplates>
-</file>
-
 <file path=customXml/item4.xml><?xml version="1.0" encoding="utf-8"?>
-<b:Sources xmlns:b="http://schemas.openxmlformats.org/officeDocument/2006/bibliography" xmlns="http://schemas.openxmlformats.org/officeDocument/2006/bibliography" SelectedStyle="\APA.XSL" StyleName="APA"/>
+<p:properties xmlns:p="http://schemas.microsoft.com/office/2006/metadata/properties" xmlns:xsi="http://www.w3.org/2001/XMLSchema-instance" xmlns:pc="http://schemas.microsoft.com/office/infopath/2007/PartnerControls">
+  <documentManagement/>
+</p:properties>
 </file>
 
 <file path=customXml/itemProps1.xml><?xml version="1.0" encoding="utf-8"?>
-<ds:datastoreItem xmlns:ds="http://schemas.openxmlformats.org/officeDocument/2006/customXml" ds:itemID="{1B540EF3-C268-4ED8-B5D7-73CF42074C5F}">
+<ds:datastoreItem xmlns:ds="http://schemas.openxmlformats.org/officeDocument/2006/customXml" ds:itemID="{AB382A38-F7DF-494E-9541-0AC2A9EABC37}">
   <ds:schemaRefs>
-    <ds:schemaRef ds:uri="http://schemas.microsoft.com/office/2006/metadata/properties"/>
-    <ds:schemaRef ds:uri="http://schemas.microsoft.com/office/infopath/2007/PartnerControls"/>
+    <ds:schemaRef ds:uri="http://schemas.openxmlformats.org/officeDocument/2006/bibliography"/>
   </ds:schemaRefs>
 </ds:datastoreItem>
 </file>
 
 <file path=customXml/itemProps2.xml><?xml version="1.0" encoding="utf-8"?>
+<ds:datastoreItem xmlns:ds="http://schemas.openxmlformats.org/officeDocument/2006/customXml" ds:itemID="{00BE90CA-FC5B-441A-A974-4C972A566154}">
+  <ds:schemaRefs>
+    <ds:schemaRef ds:uri="http://schemas.microsoft.com/sharepoint/v3/contenttype/forms"/>
+  </ds:schemaRefs>
+</ds:datastoreItem>
+</file>
+
+<file path=customXml/itemProps3.xml><?xml version="1.0" encoding="utf-8"?>
 <ds:datastoreItem xmlns:ds="http://schemas.openxmlformats.org/officeDocument/2006/customXml" ds:itemID="{C1F70AEC-3E9B-40D5-ABA9-060FFFF4BD83}">
   <ds:schemaRefs>
     <ds:schemaRef ds:uri="http://schemas.microsoft.com/office/2006/metadata/contentType"/>
@@ -13866,18 +14221,11 @@
 </ds:datastoreItem>
 </file>
 
-<file path=customXml/itemProps3.xml><?xml version="1.0" encoding="utf-8"?>
-<ds:datastoreItem xmlns:ds="http://schemas.openxmlformats.org/officeDocument/2006/customXml" ds:itemID="{00BE90CA-FC5B-441A-A974-4C972A566154}">
+<file path=customXml/itemProps4.xml><?xml version="1.0" encoding="utf-8"?>
+<ds:datastoreItem xmlns:ds="http://schemas.openxmlformats.org/officeDocument/2006/customXml" ds:itemID="{1B540EF3-C268-4ED8-B5D7-73CF42074C5F}">
   <ds:schemaRefs>
-    <ds:schemaRef ds:uri="http://schemas.microsoft.com/sharepoint/v3/contenttype/forms"/>
-  </ds:schemaRefs>
-</ds:datastoreItem>
-</file>
-
-<file path=customXml/itemProps4.xml><?xml version="1.0" encoding="utf-8"?>
-<ds:datastoreItem xmlns:ds="http://schemas.openxmlformats.org/officeDocument/2006/customXml" ds:itemID="{AB382A38-F7DF-494E-9541-0AC2A9EABC37}">
-  <ds:schemaRefs>
-    <ds:schemaRef ds:uri="http://schemas.openxmlformats.org/officeDocument/2006/bibliography"/>
+    <ds:schemaRef ds:uri="http://schemas.microsoft.com/office/2006/metadata/properties"/>
+    <ds:schemaRef ds:uri="http://schemas.microsoft.com/office/infopath/2007/PartnerControls"/>
   </ds:schemaRefs>
 </ds:datastoreItem>
 </file>
</xml_diff>

<commit_message>
📝 Update Ethical Form
The Ethical form has been finalised and ready for submission on Moodle
</commit_message>
<xml_diff>
--- a/docs/Ethical Approval Form.docx
+++ b/docs/Ethical Approval Form.docx
@@ -34,7 +34,7 @@
             <v:path o:extrusionok="f" gradientshapeok="t" o:connecttype="rect"/>
             <o:lock v:ext="edit" aspectratio="t"/>
           </v:shapetype>
-          <v:shape id="_x0000_s2069" type="#_x0000_t75" alt="DkIT Logo_Large_Web" style="position:absolute;left:0;text-align:left;margin-left:163.3pt;margin-top:-33.55pt;width:120.6pt;height:62.4pt;z-index:4;mso-wrap-edited:f">
+          <v:shape id="_x0000_s2069" type="#_x0000_t75" alt="DkIT Logo_Large_Web" style="position:absolute;left:0;text-align:left;margin-left:163.3pt;margin-top:-33.55pt;width:120.6pt;height:62.4pt;z-index:251658243;mso-wrap-edited:f">
             <v:imagedata r:id="rId11" o:title="DkIT Logo_Large_Web"/>
           </v:shape>
         </w:pict>
@@ -575,23 +575,62 @@
           <w:szCs w:val="22"/>
           <w:lang w:val="en-IE"/>
         </w:rPr>
-        <w:t xml:space="preserve">sing Time </w:t>
-      </w:r>
-      <w:r>
-        <w:rPr>
-          <w:sz w:val="22"/>
-          <w:szCs w:val="22"/>
-          <w:lang w:val="en-IE"/>
-        </w:rPr>
-        <w:t>S</w:t>
-      </w:r>
-      <w:r>
-        <w:rPr>
-          <w:sz w:val="22"/>
-          <w:szCs w:val="22"/>
-          <w:lang w:val="en-IE"/>
-        </w:rPr>
-        <w:t>eries</w:t>
+        <w:t xml:space="preserve">sing </w:t>
+      </w:r>
+      <w:r>
+        <w:rPr>
+          <w:sz w:val="22"/>
+          <w:szCs w:val="22"/>
+        </w:rPr>
+        <w:t>Machine Learning</w:t>
+      </w:r>
+      <w:r>
+        <w:rPr>
+          <w:sz w:val="22"/>
+          <w:szCs w:val="22"/>
+        </w:rPr>
+        <w:t xml:space="preserve"> Techniques</w:t>
+      </w:r>
+    </w:p>
+    <w:p>
+      <w:pPr>
+        <w:ind w:right="-483"/>
+        <w:rPr>
+          <w:sz w:val="22"/>
+          <w:szCs w:val="22"/>
+        </w:rPr>
+      </w:pPr>
+    </w:p>
+    <w:p>
+      <w:pPr>
+        <w:ind w:right="-483"/>
+        <w:rPr>
+          <w:sz w:val="22"/>
+          <w:szCs w:val="22"/>
+        </w:rPr>
+      </w:pPr>
+    </w:p>
+    <w:p>
+      <w:pPr>
+        <w:ind w:right="-483"/>
+        <w:rPr>
+          <w:sz w:val="22"/>
+          <w:szCs w:val="22"/>
+        </w:rPr>
+      </w:pPr>
+      <w:r>
+        <w:rPr>
+          <w:sz w:val="22"/>
+          <w:szCs w:val="22"/>
+        </w:rPr>
+        <w:t>Name of supervisor/s</w:t>
+      </w:r>
+      <w:r>
+        <w:rPr>
+          <w:sz w:val="22"/>
+          <w:szCs w:val="22"/>
+        </w:rPr>
+        <w:t>:</w:t>
       </w:r>
       <w:r>
         <w:rPr>
@@ -600,39 +639,33 @@
         </w:rPr>
         <w:t xml:space="preserve"> </w:t>
       </w:r>
-    </w:p>
-    <w:p>
-      <w:pPr>
-        <w:ind w:right="-483"/>
-        <w:rPr>
-          <w:sz w:val="22"/>
-          <w:szCs w:val="22"/>
-        </w:rPr>
-      </w:pPr>
-    </w:p>
-    <w:p>
-      <w:pPr>
-        <w:ind w:right="-483"/>
-        <w:rPr>
-          <w:sz w:val="22"/>
-          <w:szCs w:val="22"/>
-        </w:rPr>
-      </w:pPr>
-    </w:p>
-    <w:p>
-      <w:pPr>
-        <w:ind w:right="-483"/>
-        <w:rPr>
-          <w:sz w:val="22"/>
-          <w:szCs w:val="22"/>
-        </w:rPr>
-      </w:pPr>
-      <w:r>
-        <w:rPr>
-          <w:sz w:val="22"/>
-          <w:szCs w:val="22"/>
-        </w:rPr>
-        <w:t>Name of supervisor/s</w:t>
+      <w:r>
+        <w:rPr>
+          <w:sz w:val="22"/>
+          <w:szCs w:val="22"/>
+        </w:rPr>
+        <w:t>Samuel Moore</w:t>
+      </w:r>
+      <w:r>
+        <w:rPr>
+          <w:sz w:val="22"/>
+          <w:szCs w:val="22"/>
+        </w:rPr>
+        <w:t xml:space="preserve"> </w:t>
+      </w:r>
+      <w:r>
+        <w:rPr>
+          <w:sz w:val="22"/>
+          <w:szCs w:val="22"/>
+        </w:rPr>
+        <w:tab/>
+      </w:r>
+      <w:r>
+        <w:rPr>
+          <w:sz w:val="22"/>
+          <w:szCs w:val="22"/>
+        </w:rPr>
+        <w:t>Date</w:t>
       </w:r>
       <w:r>
         <w:rPr>
@@ -653,49 +686,14 @@
           <w:sz w:val="22"/>
           <w:szCs w:val="22"/>
         </w:rPr>
-        <w:t>Samuel Moore</w:t>
-      </w:r>
-      <w:r>
-        <w:rPr>
-          <w:sz w:val="22"/>
-          <w:szCs w:val="22"/>
-        </w:rPr>
-        <w:t xml:space="preserve"> </w:t>
-      </w:r>
-      <w:r>
-        <w:rPr>
-          <w:sz w:val="22"/>
-          <w:szCs w:val="22"/>
-        </w:rPr>
-        <w:tab/>
-      </w:r>
-      <w:r>
-        <w:rPr>
-          <w:sz w:val="22"/>
-          <w:szCs w:val="22"/>
-        </w:rPr>
-        <w:t>Date</w:t>
-      </w:r>
-      <w:r>
-        <w:rPr>
-          <w:sz w:val="22"/>
-          <w:szCs w:val="22"/>
-        </w:rPr>
-        <w:t>:</w:t>
-      </w:r>
-      <w:r>
-        <w:rPr>
-          <w:sz w:val="22"/>
-          <w:szCs w:val="22"/>
-        </w:rPr>
-        <w:t xml:space="preserve"> </w:t>
-      </w:r>
-      <w:r>
-        <w:rPr>
-          <w:sz w:val="22"/>
-          <w:szCs w:val="22"/>
-        </w:rPr>
-        <w:t>11/03/2026</w:t>
+        <w:t>25</w:t>
+      </w:r>
+      <w:r>
+        <w:rPr>
+          <w:sz w:val="22"/>
+          <w:szCs w:val="22"/>
+        </w:rPr>
+        <w:t>/03/2026</w:t>
       </w:r>
     </w:p>
     <w:p>
@@ -891,19 +889,8 @@
           <w:sz w:val="22"/>
           <w:szCs w:val="22"/>
         </w:rPr>
-        <w:t xml:space="preserve">, your application will be returned to </w:t>
-      </w:r>
-      <w:proofErr w:type="gramStart"/>
-      <w:r>
-        <w:rPr>
-          <w:b/>
-          <w:bCs/>
-          <w:sz w:val="22"/>
-          <w:szCs w:val="22"/>
-        </w:rPr>
-        <w:t>you</w:t>
-      </w:r>
-      <w:proofErr w:type="gramEnd"/>
+        <w:t>, your application will be returned to you</w:t>
+      </w:r>
       <w:r>
         <w:rPr>
           <w:b/>
@@ -1046,7 +1033,7 @@
             <v:stroke joinstyle="miter"/>
             <v:path gradientshapeok="t" o:connecttype="rect"/>
           </v:shapetype>
-          <v:shape id="_x0000_s2068" type="#_x0000_t202" style="position:absolute;margin-left:158.85pt;margin-top:2.9pt;width:17pt;height:17pt;z-index:6;mso-wrap-edited:f">
+          <v:shape id="_x0000_s2068" type="#_x0000_t202" style="position:absolute;margin-left:158.85pt;margin-top:2.9pt;width:17pt;height:17pt;z-index:251658245;mso-wrap-edited:f">
             <v:textbox style="mso-next-textbox:#_x0000_s2068">
               <w:txbxContent>
                 <w:p/>
@@ -1273,7 +1260,7 @@
           <w:lang w:eastAsia="en-GB"/>
         </w:rPr>
         <w:pict w14:anchorId="3AC235CD">
-          <v:shape id="_x0000_s2067" type="#_x0000_t202" style="position:absolute;margin-left:158.85pt;margin-top:6.85pt;width:17pt;height:17pt;z-index:7;mso-wrap-edited:f">
+          <v:shape id="_x0000_s2067" type="#_x0000_t202" style="position:absolute;margin-left:158.85pt;margin-top:6.85pt;width:17pt;height:17pt;z-index:251658246;mso-wrap-edited:f">
             <v:textbox style="mso-next-textbox:#_x0000_s2067">
               <w:txbxContent>
                 <w:p>
@@ -1472,7 +1459,7 @@
         </w:rPr>
         <w:lastRenderedPageBreak/>
         <w:pict w14:anchorId="4796DC14">
-          <v:shape id="_x0000_s2066" type="#_x0000_t202" style="position:absolute;margin-left:158.85pt;margin-top:12.6pt;width:17pt;height:17pt;z-index:8;mso-wrap-edited:f">
+          <v:shape id="_x0000_s2066" type="#_x0000_t202" style="position:absolute;margin-left:158.85pt;margin-top:12.6pt;width:17pt;height:17pt;z-index:251658247;mso-wrap-edited:f">
             <v:textbox style="mso-next-textbox:#_x0000_s2066">
               <w:txbxContent>
                 <w:p/>
@@ -1742,10 +1729,10 @@
           <w:tcPr>
             <w:tcW w:w="391" w:type="dxa"/>
             <w:tcBorders>
-              <w:top w:val="single" w:sz="6" w:space="0" w:color="000000"/>
-              <w:left w:val="single" w:sz="6" w:space="0" w:color="000000"/>
-              <w:bottom w:val="single" w:sz="6" w:space="0" w:color="000000"/>
-              <w:right w:val="single" w:sz="6" w:space="0" w:color="000000"/>
+              <w:top w:val="single" w:sz="6" w:space="0" w:color="000000" w:themeColor="text1"/>
+              <w:left w:val="single" w:sz="6" w:space="0" w:color="000000" w:themeColor="text1"/>
+              <w:bottom w:val="single" w:sz="6" w:space="0" w:color="000000" w:themeColor="text1"/>
+              <w:right w:val="single" w:sz="6" w:space="0" w:color="000000" w:themeColor="text1"/>
             </w:tcBorders>
           </w:tcPr>
           <w:p>
@@ -1762,10 +1749,10 @@
           <w:tcPr>
             <w:tcW w:w="7727" w:type="dxa"/>
             <w:tcBorders>
-              <w:top w:val="single" w:sz="6" w:space="0" w:color="000000"/>
-              <w:left w:val="single" w:sz="6" w:space="0" w:color="000000"/>
-              <w:bottom w:val="single" w:sz="6" w:space="0" w:color="000000"/>
-              <w:right w:val="single" w:sz="6" w:space="0" w:color="000000"/>
+              <w:top w:val="single" w:sz="6" w:space="0" w:color="000000" w:themeColor="text1"/>
+              <w:left w:val="single" w:sz="6" w:space="0" w:color="000000" w:themeColor="text1"/>
+              <w:bottom w:val="single" w:sz="6" w:space="0" w:color="000000" w:themeColor="text1"/>
+              <w:right w:val="single" w:sz="6" w:space="0" w:color="000000" w:themeColor="text1"/>
             </w:tcBorders>
           </w:tcPr>
           <w:p>
@@ -1791,10 +1778,10 @@
           <w:tcPr>
             <w:tcW w:w="567" w:type="dxa"/>
             <w:tcBorders>
-              <w:top w:val="single" w:sz="6" w:space="0" w:color="000000"/>
-              <w:left w:val="single" w:sz="6" w:space="0" w:color="000000"/>
-              <w:bottom w:val="single" w:sz="6" w:space="0" w:color="000000"/>
-              <w:right w:val="single" w:sz="6" w:space="0" w:color="000000"/>
+              <w:top w:val="single" w:sz="6" w:space="0" w:color="000000" w:themeColor="text1"/>
+              <w:left w:val="single" w:sz="6" w:space="0" w:color="000000" w:themeColor="text1"/>
+              <w:bottom w:val="single" w:sz="6" w:space="0" w:color="000000" w:themeColor="text1"/>
+              <w:right w:val="single" w:sz="6" w:space="0" w:color="000000" w:themeColor="text1"/>
             </w:tcBorders>
             <w:vAlign w:val="center"/>
           </w:tcPr>
@@ -1819,10 +1806,10 @@
           <w:tcPr>
             <w:tcW w:w="567" w:type="dxa"/>
             <w:tcBorders>
-              <w:top w:val="single" w:sz="6" w:space="0" w:color="000000"/>
-              <w:left w:val="single" w:sz="6" w:space="0" w:color="000000"/>
-              <w:bottom w:val="single" w:sz="6" w:space="0" w:color="000000"/>
-              <w:right w:val="single" w:sz="6" w:space="0" w:color="000000"/>
+              <w:top w:val="single" w:sz="6" w:space="0" w:color="000000" w:themeColor="text1"/>
+              <w:left w:val="single" w:sz="6" w:space="0" w:color="000000" w:themeColor="text1"/>
+              <w:bottom w:val="single" w:sz="6" w:space="0" w:color="000000" w:themeColor="text1"/>
+              <w:right w:val="single" w:sz="6" w:space="0" w:color="000000" w:themeColor="text1"/>
             </w:tcBorders>
             <w:vAlign w:val="center"/>
           </w:tcPr>
@@ -1852,10 +1839,10 @@
           <w:tcPr>
             <w:tcW w:w="391" w:type="dxa"/>
             <w:tcBorders>
-              <w:top w:val="single" w:sz="6" w:space="0" w:color="000000"/>
-              <w:left w:val="single" w:sz="6" w:space="0" w:color="000000"/>
-              <w:bottom w:val="single" w:sz="6" w:space="0" w:color="000000"/>
-              <w:right w:val="single" w:sz="6" w:space="0" w:color="000000"/>
+              <w:top w:val="single" w:sz="6" w:space="0" w:color="000000" w:themeColor="text1"/>
+              <w:left w:val="single" w:sz="6" w:space="0" w:color="000000" w:themeColor="text1"/>
+              <w:bottom w:val="single" w:sz="6" w:space="0" w:color="000000" w:themeColor="text1"/>
+              <w:right w:val="single" w:sz="6" w:space="0" w:color="000000" w:themeColor="text1"/>
             </w:tcBorders>
             <w:vAlign w:val="center"/>
           </w:tcPr>
@@ -1880,10 +1867,10 @@
           <w:tcPr>
             <w:tcW w:w="7727" w:type="dxa"/>
             <w:tcBorders>
-              <w:top w:val="single" w:sz="6" w:space="0" w:color="000000"/>
-              <w:left w:val="single" w:sz="6" w:space="0" w:color="000000"/>
-              <w:bottom w:val="single" w:sz="6" w:space="0" w:color="000000"/>
-              <w:right w:val="single" w:sz="6" w:space="0" w:color="000000"/>
+              <w:top w:val="single" w:sz="6" w:space="0" w:color="000000" w:themeColor="text1"/>
+              <w:left w:val="single" w:sz="6" w:space="0" w:color="000000" w:themeColor="text1"/>
+              <w:bottom w:val="single" w:sz="6" w:space="0" w:color="000000" w:themeColor="text1"/>
+              <w:right w:val="single" w:sz="6" w:space="0" w:color="000000" w:themeColor="text1"/>
             </w:tcBorders>
             <w:vAlign w:val="center"/>
           </w:tcPr>
@@ -2080,43 +2067,7 @@
                 <w:szCs w:val="22"/>
                 <w:lang w:val="en-US" w:eastAsia="en-US"/>
               </w:rPr>
-              <w:t xml:space="preserve">Observations of human </w:t>
-            </w:r>
-            <w:proofErr w:type="spellStart"/>
-            <w:r>
-              <w:rPr>
-                <w:sz w:val="22"/>
-                <w:szCs w:val="22"/>
-                <w:lang w:val="en-US" w:eastAsia="en-US"/>
-              </w:rPr>
-              <w:t>behaviour</w:t>
-            </w:r>
-            <w:proofErr w:type="spellEnd"/>
-            <w:r>
-              <w:rPr>
-                <w:sz w:val="22"/>
-                <w:szCs w:val="22"/>
-                <w:lang w:val="en-US" w:eastAsia="en-US"/>
-              </w:rPr>
-              <w:t xml:space="preserve"> in public where (</w:t>
-            </w:r>
-            <w:proofErr w:type="spellStart"/>
-            <w:r>
-              <w:rPr>
-                <w:sz w:val="22"/>
-                <w:szCs w:val="22"/>
-                <w:lang w:val="en-US" w:eastAsia="en-US"/>
-              </w:rPr>
-              <w:t>i</w:t>
-            </w:r>
-            <w:proofErr w:type="spellEnd"/>
-            <w:r>
-              <w:rPr>
-                <w:sz w:val="22"/>
-                <w:szCs w:val="22"/>
-                <w:lang w:val="en-US" w:eastAsia="en-US"/>
-              </w:rPr>
-              <w:t>) those being observed have no reasonable expectation of privacy, (ii) there is no intervention on the part of the researcher nor any interaction between the researcher and those observed, and (iii) individuals are not identifiable in the results.</w:t>
+              <w:t>Observations of human behaviour in public where (i) those being observed have no reasonable expectation of privacy, (ii) there is no intervention on the part of the researcher nor any interaction between the researcher and those observed, and (iii) individuals are not identifiable in the results.</w:t>
             </w:r>
           </w:p>
           <w:p>
@@ -2231,10 +2182,10 @@
           <w:tcPr>
             <w:tcW w:w="567" w:type="dxa"/>
             <w:tcBorders>
-              <w:top w:val="single" w:sz="6" w:space="0" w:color="000000"/>
-              <w:left w:val="single" w:sz="6" w:space="0" w:color="000000"/>
-              <w:bottom w:val="single" w:sz="6" w:space="0" w:color="000000"/>
-              <w:right w:val="single" w:sz="6" w:space="0" w:color="000000"/>
+              <w:top w:val="single" w:sz="6" w:space="0" w:color="000000" w:themeColor="text1"/>
+              <w:left w:val="single" w:sz="6" w:space="0" w:color="000000" w:themeColor="text1"/>
+              <w:bottom w:val="single" w:sz="6" w:space="0" w:color="000000" w:themeColor="text1"/>
+              <w:right w:val="single" w:sz="6" w:space="0" w:color="000000" w:themeColor="text1"/>
             </w:tcBorders>
           </w:tcPr>
           <w:p>
@@ -2251,20 +2202,27 @@
           <w:tcPr>
             <w:tcW w:w="567" w:type="dxa"/>
             <w:tcBorders>
-              <w:top w:val="single" w:sz="6" w:space="0" w:color="000000"/>
-              <w:left w:val="single" w:sz="6" w:space="0" w:color="000000"/>
-              <w:bottom w:val="single" w:sz="6" w:space="0" w:color="000000"/>
-              <w:right w:val="single" w:sz="6" w:space="0" w:color="000000"/>
+              <w:top w:val="single" w:sz="6" w:space="0" w:color="000000" w:themeColor="text1"/>
+              <w:left w:val="single" w:sz="6" w:space="0" w:color="000000" w:themeColor="text1"/>
+              <w:bottom w:val="single" w:sz="6" w:space="0" w:color="000000" w:themeColor="text1"/>
+              <w:right w:val="single" w:sz="6" w:space="0" w:color="000000" w:themeColor="text1"/>
             </w:tcBorders>
           </w:tcPr>
           <w:p>
             <w:pPr>
-              <w:jc w:val="both"/>
-              <w:rPr>
-                <w:sz w:val="22"/>
-                <w:szCs w:val="22"/>
-              </w:rPr>
-            </w:pPr>
+              <w:rPr>
+                <w:sz w:val="6"/>
+                <w:szCs w:val="6"/>
+              </w:rPr>
+            </w:pPr>
+            <w:r>
+              <w:rPr>
+                <w:rFonts w:ascii="Segoe UI Symbol" w:hAnsi="Segoe UI Symbol" w:cs="Segoe UI Symbol"/>
+                <w:sz w:val="14"/>
+                <w:szCs w:val="14"/>
+              </w:rPr>
+              <w:t>✓</w:t>
+            </w:r>
           </w:p>
         </w:tc>
       </w:tr>
@@ -2276,10 +2234,10 @@
           <w:tcPr>
             <w:tcW w:w="391" w:type="dxa"/>
             <w:tcBorders>
-              <w:top w:val="single" w:sz="6" w:space="0" w:color="000000"/>
-              <w:left w:val="single" w:sz="6" w:space="0" w:color="000000"/>
-              <w:bottom w:val="single" w:sz="6" w:space="0" w:color="000000"/>
-              <w:right w:val="single" w:sz="6" w:space="0" w:color="000000"/>
+              <w:top w:val="single" w:sz="6" w:space="0" w:color="000000" w:themeColor="text1"/>
+              <w:left w:val="single" w:sz="6" w:space="0" w:color="000000" w:themeColor="text1"/>
+              <w:bottom w:val="single" w:sz="6" w:space="0" w:color="000000" w:themeColor="text1"/>
+              <w:right w:val="single" w:sz="6" w:space="0" w:color="000000" w:themeColor="text1"/>
             </w:tcBorders>
             <w:vAlign w:val="center"/>
           </w:tcPr>
@@ -2304,10 +2262,10 @@
           <w:tcPr>
             <w:tcW w:w="7727" w:type="dxa"/>
             <w:tcBorders>
-              <w:top w:val="single" w:sz="6" w:space="0" w:color="000000"/>
-              <w:left w:val="single" w:sz="6" w:space="0" w:color="000000"/>
-              <w:bottom w:val="single" w:sz="6" w:space="0" w:color="000000"/>
-              <w:right w:val="single" w:sz="6" w:space="0" w:color="000000"/>
+              <w:top w:val="single" w:sz="6" w:space="0" w:color="000000" w:themeColor="text1"/>
+              <w:left w:val="single" w:sz="6" w:space="0" w:color="000000" w:themeColor="text1"/>
+              <w:bottom w:val="single" w:sz="6" w:space="0" w:color="000000" w:themeColor="text1"/>
+              <w:right w:val="single" w:sz="6" w:space="0" w:color="000000" w:themeColor="text1"/>
             </w:tcBorders>
           </w:tcPr>
           <w:p>
@@ -2460,10 +2418,10 @@
           <w:tcPr>
             <w:tcW w:w="567" w:type="dxa"/>
             <w:tcBorders>
-              <w:top w:val="single" w:sz="6" w:space="0" w:color="000000"/>
-              <w:left w:val="single" w:sz="6" w:space="0" w:color="000000"/>
-              <w:bottom w:val="single" w:sz="6" w:space="0" w:color="000000"/>
-              <w:right w:val="single" w:sz="6" w:space="0" w:color="000000"/>
+              <w:top w:val="single" w:sz="6" w:space="0" w:color="000000" w:themeColor="text1"/>
+              <w:left w:val="single" w:sz="6" w:space="0" w:color="000000" w:themeColor="text1"/>
+              <w:bottom w:val="single" w:sz="6" w:space="0" w:color="000000" w:themeColor="text1"/>
+              <w:right w:val="single" w:sz="6" w:space="0" w:color="000000" w:themeColor="text1"/>
             </w:tcBorders>
           </w:tcPr>
           <w:p>
@@ -2480,12 +2438,28 @@
           <w:tcPr>
             <w:tcW w:w="567" w:type="dxa"/>
             <w:tcBorders>
-              <w:top w:val="single" w:sz="6" w:space="0" w:color="000000"/>
-              <w:left w:val="single" w:sz="6" w:space="0" w:color="000000"/>
-              <w:bottom w:val="single" w:sz="6" w:space="0" w:color="000000"/>
-              <w:right w:val="single" w:sz="6" w:space="0" w:color="000000"/>
+              <w:top w:val="single" w:sz="6" w:space="0" w:color="000000" w:themeColor="text1"/>
+              <w:left w:val="single" w:sz="6" w:space="0" w:color="000000" w:themeColor="text1"/>
+              <w:bottom w:val="single" w:sz="6" w:space="0" w:color="000000" w:themeColor="text1"/>
+              <w:right w:val="single" w:sz="6" w:space="0" w:color="000000" w:themeColor="text1"/>
             </w:tcBorders>
           </w:tcPr>
+          <w:p>
+            <w:pPr>
+              <w:rPr>
+                <w:sz w:val="6"/>
+                <w:szCs w:val="6"/>
+              </w:rPr>
+            </w:pPr>
+            <w:r>
+              <w:rPr>
+                <w:rFonts w:ascii="Segoe UI Symbol" w:hAnsi="Segoe UI Symbol" w:cs="Segoe UI Symbol"/>
+                <w:sz w:val="14"/>
+                <w:szCs w:val="14"/>
+              </w:rPr>
+              <w:t>✓</w:t>
+            </w:r>
+          </w:p>
           <w:p>
             <w:pPr>
               <w:jc w:val="both"/>
@@ -2505,10 +2479,10 @@
           <w:tcPr>
             <w:tcW w:w="391" w:type="dxa"/>
             <w:tcBorders>
-              <w:top w:val="single" w:sz="6" w:space="0" w:color="000000"/>
-              <w:left w:val="single" w:sz="6" w:space="0" w:color="000000"/>
-              <w:bottom w:val="single" w:sz="6" w:space="0" w:color="000000"/>
-              <w:right w:val="single" w:sz="6" w:space="0" w:color="000000"/>
+              <w:top w:val="single" w:sz="6" w:space="0" w:color="000000" w:themeColor="text1"/>
+              <w:left w:val="single" w:sz="6" w:space="0" w:color="000000" w:themeColor="text1"/>
+              <w:bottom w:val="single" w:sz="6" w:space="0" w:color="000000" w:themeColor="text1"/>
+              <w:right w:val="single" w:sz="6" w:space="0" w:color="000000" w:themeColor="text1"/>
             </w:tcBorders>
             <w:vAlign w:val="center"/>
           </w:tcPr>
@@ -2533,10 +2507,10 @@
           <w:tcPr>
             <w:tcW w:w="7727" w:type="dxa"/>
             <w:tcBorders>
-              <w:top w:val="single" w:sz="6" w:space="0" w:color="000000"/>
-              <w:left w:val="single" w:sz="6" w:space="0" w:color="000000"/>
-              <w:bottom w:val="single" w:sz="6" w:space="0" w:color="000000"/>
-              <w:right w:val="single" w:sz="6" w:space="0" w:color="000000"/>
+              <w:top w:val="single" w:sz="6" w:space="0" w:color="000000" w:themeColor="text1"/>
+              <w:left w:val="single" w:sz="6" w:space="0" w:color="000000" w:themeColor="text1"/>
+              <w:bottom w:val="single" w:sz="6" w:space="0" w:color="000000" w:themeColor="text1"/>
+              <w:right w:val="single" w:sz="6" w:space="0" w:color="000000" w:themeColor="text1"/>
             </w:tcBorders>
           </w:tcPr>
           <w:p>
@@ -2791,10 +2765,10 @@
           <w:tcPr>
             <w:tcW w:w="567" w:type="dxa"/>
             <w:tcBorders>
-              <w:top w:val="single" w:sz="6" w:space="0" w:color="000000"/>
-              <w:left w:val="single" w:sz="6" w:space="0" w:color="000000"/>
-              <w:bottom w:val="single" w:sz="6" w:space="0" w:color="000000"/>
-              <w:right w:val="single" w:sz="6" w:space="0" w:color="000000"/>
+              <w:top w:val="single" w:sz="6" w:space="0" w:color="000000" w:themeColor="text1"/>
+              <w:left w:val="single" w:sz="6" w:space="0" w:color="000000" w:themeColor="text1"/>
+              <w:bottom w:val="single" w:sz="6" w:space="0" w:color="000000" w:themeColor="text1"/>
+              <w:right w:val="single" w:sz="6" w:space="0" w:color="000000" w:themeColor="text1"/>
             </w:tcBorders>
           </w:tcPr>
           <w:p>
@@ -2811,12 +2785,28 @@
           <w:tcPr>
             <w:tcW w:w="567" w:type="dxa"/>
             <w:tcBorders>
-              <w:top w:val="single" w:sz="6" w:space="0" w:color="000000"/>
-              <w:left w:val="single" w:sz="6" w:space="0" w:color="000000"/>
-              <w:bottom w:val="single" w:sz="6" w:space="0" w:color="000000"/>
-              <w:right w:val="single" w:sz="6" w:space="0" w:color="000000"/>
+              <w:top w:val="single" w:sz="6" w:space="0" w:color="000000" w:themeColor="text1"/>
+              <w:left w:val="single" w:sz="6" w:space="0" w:color="000000" w:themeColor="text1"/>
+              <w:bottom w:val="single" w:sz="6" w:space="0" w:color="000000" w:themeColor="text1"/>
+              <w:right w:val="single" w:sz="6" w:space="0" w:color="000000" w:themeColor="text1"/>
             </w:tcBorders>
           </w:tcPr>
+          <w:p>
+            <w:pPr>
+              <w:rPr>
+                <w:sz w:val="6"/>
+                <w:szCs w:val="6"/>
+              </w:rPr>
+            </w:pPr>
+            <w:r>
+              <w:rPr>
+                <w:rFonts w:ascii="Segoe UI Symbol" w:hAnsi="Segoe UI Symbol" w:cs="Segoe UI Symbol"/>
+                <w:sz w:val="14"/>
+                <w:szCs w:val="14"/>
+              </w:rPr>
+              <w:t>✓</w:t>
+            </w:r>
+          </w:p>
           <w:p>
             <w:pPr>
               <w:jc w:val="both"/>
@@ -2836,10 +2826,10 @@
           <w:tcPr>
             <w:tcW w:w="391" w:type="dxa"/>
             <w:tcBorders>
-              <w:top w:val="single" w:sz="6" w:space="0" w:color="000000"/>
-              <w:left w:val="single" w:sz="6" w:space="0" w:color="000000"/>
-              <w:bottom w:val="single" w:sz="6" w:space="0" w:color="000000"/>
-              <w:right w:val="single" w:sz="6" w:space="0" w:color="000000"/>
+              <w:top w:val="single" w:sz="6" w:space="0" w:color="000000" w:themeColor="text1"/>
+              <w:left w:val="single" w:sz="6" w:space="0" w:color="000000" w:themeColor="text1"/>
+              <w:bottom w:val="single" w:sz="6" w:space="0" w:color="000000" w:themeColor="text1"/>
+              <w:right w:val="single" w:sz="6" w:space="0" w:color="000000" w:themeColor="text1"/>
             </w:tcBorders>
             <w:vAlign w:val="center"/>
           </w:tcPr>
@@ -2864,10 +2854,10 @@
           <w:tcPr>
             <w:tcW w:w="7727" w:type="dxa"/>
             <w:tcBorders>
-              <w:top w:val="single" w:sz="6" w:space="0" w:color="000000"/>
-              <w:left w:val="single" w:sz="6" w:space="0" w:color="000000"/>
-              <w:bottom w:val="single" w:sz="6" w:space="0" w:color="000000"/>
-              <w:right w:val="single" w:sz="6" w:space="0" w:color="000000"/>
+              <w:top w:val="single" w:sz="6" w:space="0" w:color="000000" w:themeColor="text1"/>
+              <w:left w:val="single" w:sz="6" w:space="0" w:color="000000" w:themeColor="text1"/>
+              <w:bottom w:val="single" w:sz="6" w:space="0" w:color="000000" w:themeColor="text1"/>
+              <w:right w:val="single" w:sz="6" w:space="0" w:color="000000" w:themeColor="text1"/>
             </w:tcBorders>
           </w:tcPr>
           <w:p>
@@ -3008,10 +2998,10 @@
           <w:tcPr>
             <w:tcW w:w="567" w:type="dxa"/>
             <w:tcBorders>
-              <w:top w:val="single" w:sz="6" w:space="0" w:color="000000"/>
-              <w:left w:val="single" w:sz="6" w:space="0" w:color="000000"/>
-              <w:bottom w:val="single" w:sz="6" w:space="0" w:color="000000"/>
-              <w:right w:val="single" w:sz="6" w:space="0" w:color="000000"/>
+              <w:top w:val="single" w:sz="6" w:space="0" w:color="000000" w:themeColor="text1"/>
+              <w:left w:val="single" w:sz="6" w:space="0" w:color="000000" w:themeColor="text1"/>
+              <w:bottom w:val="single" w:sz="6" w:space="0" w:color="000000" w:themeColor="text1"/>
+              <w:right w:val="single" w:sz="6" w:space="0" w:color="000000" w:themeColor="text1"/>
             </w:tcBorders>
           </w:tcPr>
           <w:p>
@@ -3028,12 +3018,28 @@
           <w:tcPr>
             <w:tcW w:w="567" w:type="dxa"/>
             <w:tcBorders>
-              <w:top w:val="single" w:sz="6" w:space="0" w:color="000000"/>
-              <w:left w:val="single" w:sz="6" w:space="0" w:color="000000"/>
-              <w:bottom w:val="single" w:sz="6" w:space="0" w:color="000000"/>
-              <w:right w:val="single" w:sz="6" w:space="0" w:color="000000"/>
+              <w:top w:val="single" w:sz="6" w:space="0" w:color="000000" w:themeColor="text1"/>
+              <w:left w:val="single" w:sz="6" w:space="0" w:color="000000" w:themeColor="text1"/>
+              <w:bottom w:val="single" w:sz="6" w:space="0" w:color="000000" w:themeColor="text1"/>
+              <w:right w:val="single" w:sz="6" w:space="0" w:color="000000" w:themeColor="text1"/>
             </w:tcBorders>
           </w:tcPr>
+          <w:p>
+            <w:pPr>
+              <w:rPr>
+                <w:sz w:val="6"/>
+                <w:szCs w:val="6"/>
+              </w:rPr>
+            </w:pPr>
+            <w:r>
+              <w:rPr>
+                <w:rFonts w:ascii="Segoe UI Symbol" w:hAnsi="Segoe UI Symbol" w:cs="Segoe UI Symbol"/>
+                <w:sz w:val="14"/>
+                <w:szCs w:val="14"/>
+              </w:rPr>
+              <w:t>✓</w:t>
+            </w:r>
+          </w:p>
           <w:p>
             <w:pPr>
               <w:jc w:val="both"/>
@@ -3122,7 +3128,7 @@
           <w:lang w:eastAsia="en-GB"/>
         </w:rPr>
         <w:pict w14:anchorId="0185C69B">
-          <v:shape id="_x0000_s2065" type="#_x0000_t202" style="position:absolute;left:0;text-align:left;margin-left:433.05pt;margin-top:32.35pt;width:17pt;height:17pt;z-index:1;mso-wrap-edited:f">
+          <v:shape id="_x0000_s2065" type="#_x0000_t202" style="position:absolute;left:0;text-align:left;margin-left:433.05pt;margin-top:32.35pt;width:17pt;height:17pt;z-index:251658240;mso-wrap-edited:f">
             <v:textbox style="mso-next-textbox:#_x0000_s2065">
               <w:txbxContent>
                 <w:p/>
@@ -3405,7 +3411,7 @@
           <w:sz w:val="22"/>
           <w:szCs w:val="22"/>
         </w:rPr>
-        <w:t>YES / NO</w:t>
+        <w:t>NO</w:t>
       </w:r>
     </w:p>
     <w:p>
@@ -3635,20 +3641,6 @@
           <w:sz w:val="22"/>
           <w:szCs w:val="22"/>
         </w:rPr>
-        <w:t>YES /</w:t>
-      </w:r>
-      <w:r>
-        <w:rPr>
-          <w:sz w:val="22"/>
-          <w:szCs w:val="22"/>
-        </w:rPr>
-        <w:t xml:space="preserve"> </w:t>
-      </w:r>
-      <w:r>
-        <w:rPr>
-          <w:sz w:val="22"/>
-          <w:szCs w:val="22"/>
-        </w:rPr>
         <w:t>NO</w:t>
       </w:r>
     </w:p>
@@ -3877,7 +3869,21 @@
           <w:sz w:val="22"/>
           <w:szCs w:val="22"/>
         </w:rPr>
-        <w:t>roject with ethical clearance: _____________________________________</w:t>
+        <w:t>roject with ethical clearance:</w:t>
+      </w:r>
+      <w:r>
+        <w:rPr>
+          <w:sz w:val="22"/>
+          <w:szCs w:val="22"/>
+        </w:rPr>
+        <w:t xml:space="preserve"> </w:t>
+      </w:r>
+      <w:r>
+        <w:rPr>
+          <w:sz w:val="22"/>
+          <w:szCs w:val="22"/>
+        </w:rPr>
+        <w:t>N/A</w:t>
       </w:r>
     </w:p>
     <w:p>
@@ -4010,20 +4016,6 @@
           <w:sz w:val="22"/>
           <w:szCs w:val="22"/>
         </w:rPr>
-        <w:t>YES /</w:t>
-      </w:r>
-      <w:r>
-        <w:rPr>
-          <w:sz w:val="22"/>
-          <w:szCs w:val="22"/>
-        </w:rPr>
-        <w:t xml:space="preserve"> </w:t>
-      </w:r>
-      <w:r>
-        <w:rPr>
-          <w:sz w:val="22"/>
-          <w:szCs w:val="22"/>
-        </w:rPr>
         <w:t>NO</w:t>
       </w:r>
     </w:p>
@@ -4204,7 +4196,7 @@
           <w:lang w:val="en-IE" w:eastAsia="en-IE"/>
         </w:rPr>
         <w:pict w14:anchorId="0420EBE6">
-          <v:shape id="_x0000_s2064" type="#_x0000_t202" style="position:absolute;left:0;text-align:left;margin-left:417pt;margin-top:30.9pt;width:17pt;height:17pt;z-index:5;mso-wrap-edited:f">
+          <v:shape id="_x0000_s2064" type="#_x0000_t202" style="position:absolute;left:0;text-align:left;margin-left:417pt;margin-top:30.9pt;width:17pt;height:17pt;z-index:251658244;mso-wrap-edited:f">
             <v:textbox style="mso-next-textbox:#_x0000_s2064">
               <w:txbxContent>
                 <w:p/>
@@ -4520,20 +4512,6 @@
           <w:szCs w:val="22"/>
         </w:rPr>
       </w:pPr>
-      <w:r>
-        <w:rPr>
-          <w:sz w:val="22"/>
-          <w:szCs w:val="22"/>
-        </w:rPr>
-        <w:t>YES /</w:t>
-      </w:r>
-      <w:r>
-        <w:rPr>
-          <w:sz w:val="22"/>
-          <w:szCs w:val="22"/>
-        </w:rPr>
-        <w:t xml:space="preserve"> </w:t>
-      </w:r>
       <w:r>
         <w:rPr>
           <w:sz w:val="22"/>
@@ -4981,27 +4959,7 @@
                 <w:szCs w:val="22"/>
                 <w:lang w:val="en-US"/>
               </w:rPr>
-              <w:t xml:space="preserve">INCLUDED         </w:t>
-            </w:r>
-            <w:proofErr w:type="gramStart"/>
-            <w:r>
-              <w:rPr>
-                <w:b/>
-                <w:sz w:val="22"/>
-                <w:szCs w:val="22"/>
-                <w:lang w:val="en-US"/>
-              </w:rPr>
-              <w:t xml:space="preserve">   (</w:t>
-            </w:r>
-            <w:proofErr w:type="gramEnd"/>
-            <w:r>
-              <w:rPr>
-                <w:b/>
-                <w:sz w:val="22"/>
-                <w:szCs w:val="22"/>
-                <w:lang w:val="en-US"/>
-              </w:rPr>
-              <w:t>mark as YES)</w:t>
+              <w:t>INCLUDED            (mark as YES)</w:t>
             </w:r>
           </w:p>
         </w:tc>
@@ -5875,7 +5833,6 @@
               <w:spacing w:after="200" w:line="276" w:lineRule="auto"/>
               <w:rPr>
                 <w:rFonts w:eastAsia="Calibri"/>
-                <w:bCs/>
                 <w:sz w:val="22"/>
                 <w:szCs w:val="22"/>
                 <w:lang w:val="en-IE"/>
@@ -5884,12 +5841,97 @@
             <w:r>
               <w:rPr>
                 <w:rFonts w:eastAsia="Calibri"/>
-                <w:bCs/>
                 <w:sz w:val="22"/>
                 <w:szCs w:val="22"/>
                 <w:lang w:val="en-IE"/>
               </w:rPr>
-              <w:t>To do this, I will collect data from an online music database (using an API, which is a tool that allows programs to request data automatically). I will also gather information such as each song’s release date to understand how trends have evolved. The data will then be cleaned and filtered to ensure only relevant songs are included.</w:t>
+              <w:t>To do this, I will collect data from an online music database</w:t>
+            </w:r>
+            <w:r>
+              <w:rPr>
+                <w:rFonts w:eastAsia="Calibri"/>
+                <w:sz w:val="22"/>
+                <w:szCs w:val="22"/>
+                <w:lang w:val="en-IE"/>
+              </w:rPr>
+              <w:t xml:space="preserve"> </w:t>
+            </w:r>
+            <w:r>
+              <w:rPr>
+                <w:rFonts w:eastAsia="Calibri"/>
+                <w:sz w:val="22"/>
+                <w:szCs w:val="22"/>
+                <w:lang w:val="en-IE"/>
+              </w:rPr>
+              <w:t xml:space="preserve">called </w:t>
+            </w:r>
+            <w:r>
+              <w:rPr>
+                <w:rFonts w:eastAsia="Calibri"/>
+                <w:i/>
+                <w:iCs/>
+                <w:sz w:val="22"/>
+                <w:szCs w:val="22"/>
+                <w:lang w:val="en-IE"/>
+              </w:rPr>
+              <w:t>spotify-tracks-dataset</w:t>
+            </w:r>
+            <w:r>
+              <w:rPr>
+                <w:rFonts w:eastAsia="Calibri"/>
+                <w:sz w:val="22"/>
+                <w:szCs w:val="22"/>
+                <w:lang w:val="en-IE"/>
+              </w:rPr>
+              <w:t xml:space="preserve"> </w:t>
+            </w:r>
+            <w:r>
+              <w:rPr>
+                <w:rFonts w:eastAsia="Calibri"/>
+                <w:sz w:val="22"/>
+                <w:szCs w:val="22"/>
+                <w:lang w:val="en-IE"/>
+              </w:rPr>
+              <w:t xml:space="preserve"> </w:t>
+            </w:r>
+            <w:r>
+              <w:rPr>
+                <w:rFonts w:eastAsia="Calibri"/>
+                <w:sz w:val="22"/>
+                <w:szCs w:val="22"/>
+                <w:lang w:val="en-IE"/>
+              </w:rPr>
+              <w:t>(</w:t>
+            </w:r>
+            <w:hyperlink r:id="rId20" w:history="1">
+              <w:r>
+                <w:rPr>
+                  <w:rStyle w:val="Hyperlink"/>
+                  <w:rFonts w:eastAsia="Calibri"/>
+                  <w:sz w:val="22"/>
+                  <w:szCs w:val="22"/>
+                  <w:lang w:val="en-IE"/>
+                </w:rPr>
+                <w:t>link</w:t>
+              </w:r>
+            </w:hyperlink>
+            <w:r>
+              <w:rPr>
+                <w:rFonts w:eastAsia="Calibri"/>
+                <w:sz w:val="22"/>
+                <w:szCs w:val="22"/>
+                <w:lang w:val="en-IE"/>
+              </w:rPr>
+              <w:t xml:space="preserve">), </w:t>
+            </w:r>
+            <w:r>
+              <w:rPr>
+                <w:rFonts w:eastAsia="Calibri"/>
+                <w:sz w:val="22"/>
+                <w:szCs w:val="22"/>
+                <w:lang w:val="en-IE"/>
+              </w:rPr>
+              <w:t>using an API, which is a tool that allows programs to request data automatically. I will also gather information such as each song’s release date to understand how trends have evolved. The data will then be cleaned and filtered to ensure only relevant songs are included.</w:t>
             </w:r>
           </w:p>
           <w:p>
@@ -5919,21 +5961,117 @@
               <w:spacing w:after="200" w:line="276" w:lineRule="auto"/>
               <w:rPr>
                 <w:rFonts w:eastAsia="Calibri"/>
-                <w:bCs/>
                 <w:sz w:val="22"/>
                 <w:szCs w:val="22"/>
                 <w:lang w:val="en-IE"/>
               </w:rPr>
             </w:pPr>
-            <w:r>
-              <w:rPr>
-                <w:rFonts w:eastAsia="Calibri"/>
-                <w:bCs/>
+          </w:p>
+          <w:p>
+            <w:pPr>
+              <w:spacing w:after="200" w:line="276" w:lineRule="auto"/>
+              <w:rPr>
+                <w:rFonts w:eastAsia="Calibri"/>
                 <w:sz w:val="22"/>
                 <w:szCs w:val="22"/>
                 <w:lang w:val="en-IE"/>
               </w:rPr>
-              <w:t>Participants are not directly involved in this study, as it relies entirely on publicly available music data. The findings aim to provide insight into how musical trends shift and what elements contribute to a song’s popularity.</w:t>
+            </w:pPr>
+          </w:p>
+          <w:p>
+            <w:pPr>
+              <w:spacing w:after="200" w:line="276" w:lineRule="auto"/>
+              <w:rPr>
+                <w:rFonts w:eastAsia="Calibri"/>
+                <w:sz w:val="22"/>
+                <w:szCs w:val="22"/>
+                <w:lang w:val="en-IE"/>
+              </w:rPr>
+            </w:pPr>
+            <w:r>
+              <w:rPr>
+                <w:rFonts w:eastAsia="Calibri"/>
+                <w:sz w:val="22"/>
+                <w:szCs w:val="22"/>
+                <w:lang w:val="en-IE"/>
+              </w:rPr>
+              <w:t xml:space="preserve">Participants are not directly involved in this study, as it relies entirely on publicly available music data. </w:t>
+            </w:r>
+            <w:r>
+              <w:rPr>
+                <w:rFonts w:eastAsia="Calibri"/>
+                <w:sz w:val="22"/>
+                <w:szCs w:val="22"/>
+                <w:lang w:val="en-IE"/>
+              </w:rPr>
+              <w:t>The dataset is available on HuggingFace</w:t>
+            </w:r>
+            <w:r>
+              <w:rPr>
+                <w:rFonts w:eastAsia="Calibri"/>
+                <w:sz w:val="22"/>
+                <w:szCs w:val="22"/>
+                <w:lang w:val="en-IE"/>
+              </w:rPr>
+              <w:t xml:space="preserve"> </w:t>
+            </w:r>
+            <w:r>
+              <w:rPr>
+                <w:rFonts w:eastAsia="Calibri"/>
+                <w:sz w:val="22"/>
+                <w:szCs w:val="22"/>
+                <w:lang w:val="en-IE"/>
+              </w:rPr>
+              <w:t xml:space="preserve">and is available under </w:t>
+            </w:r>
+            <w:r>
+              <w:rPr>
+                <w:rFonts w:eastAsia="Calibri"/>
+                <w:sz w:val="22"/>
+                <w:szCs w:val="22"/>
+                <w:lang w:val="en-IE"/>
+              </w:rPr>
+              <w:t>the BSD license</w:t>
+            </w:r>
+            <w:r>
+              <w:rPr>
+                <w:rFonts w:eastAsia="Calibri"/>
+                <w:sz w:val="22"/>
+                <w:szCs w:val="22"/>
+                <w:lang w:val="en-IE"/>
+              </w:rPr>
+              <w:t>.</w:t>
+            </w:r>
+          </w:p>
+          <w:p>
+            <w:pPr>
+              <w:spacing w:after="200" w:line="276" w:lineRule="auto"/>
+              <w:rPr>
+                <w:rFonts w:eastAsia="Calibri"/>
+                <w:sz w:val="22"/>
+                <w:szCs w:val="22"/>
+                <w:lang w:val="en-IE"/>
+              </w:rPr>
+            </w:pPr>
+          </w:p>
+          <w:p>
+            <w:pPr>
+              <w:spacing w:after="200" w:line="276" w:lineRule="auto"/>
+              <w:rPr>
+                <w:rFonts w:eastAsia="Calibri"/>
+                <w:sz w:val="22"/>
+                <w:szCs w:val="22"/>
+                <w:lang w:val="en-IE"/>
+              </w:rPr>
+            </w:pPr>
+            <w:r>
+              <w:rPr>
+                <w:rFonts w:eastAsia="Calibri"/>
+                <w:sz w:val="22"/>
+                <w:szCs w:val="22"/>
+                <w:lang w:val="en-IE"/>
+              </w:rPr>
+              <w:t>The findings aim to provide insight into how musical trends shift and what elements contribute to a song’s popularity.</w:t>
             </w:r>
           </w:p>
           <w:p>
@@ -6489,7 +6627,6 @@
                 <w:szCs w:val="22"/>
                 <w:lang w:val="en-US"/>
               </w:rPr>
-              <w:lastRenderedPageBreak/>
               <w:t>Research start date</w:t>
             </w:r>
           </w:p>
@@ -6674,16 +6811,7 @@
           <w:sz w:val="22"/>
           <w:szCs w:val="22"/>
         </w:rPr>
-        <w:t xml:space="preserve">* If location/Population other than </w:t>
-      </w:r>
-      <w:proofErr w:type="spellStart"/>
-      <w:r>
-        <w:rPr>
-          <w:bCs/>
-          <w:sz w:val="22"/>
-          <w:szCs w:val="22"/>
-        </w:rPr>
-        <w:t>D</w:t>
+        <w:t>* If location/Population other than D</w:t>
       </w:r>
       <w:r>
         <w:rPr>
@@ -6699,16 +6827,7 @@
           <w:sz w:val="22"/>
           <w:szCs w:val="22"/>
         </w:rPr>
-        <w:t>IT</w:t>
-      </w:r>
-      <w:proofErr w:type="spellEnd"/>
-      <w:r>
-        <w:rPr>
-          <w:bCs/>
-          <w:sz w:val="22"/>
-          <w:szCs w:val="22"/>
-        </w:rPr>
-        <w:t xml:space="preserve"> campus/population, provide details of the approval to gain access to that location/population as an appendix.</w:t>
+        <w:t>IT campus/population, provide details of the approval to gain access to that location/population as an appendix.</w:t>
       </w:r>
     </w:p>
     <w:p>
@@ -7901,31 +8020,7 @@
                 <w:szCs w:val="22"/>
                 <w:lang w:val="en-US"/>
               </w:rPr>
-              <w:t xml:space="preserve">Will participants be </w:t>
-            </w:r>
-            <w:proofErr w:type="gramStart"/>
-            <w:r>
-              <w:rPr>
-                <w:rFonts w:eastAsia="Calibri"/>
-                <w:b/>
-                <w:bCs/>
-                <w:sz w:val="22"/>
-                <w:szCs w:val="22"/>
-                <w:lang w:val="en-US"/>
-              </w:rPr>
-              <w:t>remunerated</w:t>
-            </w:r>
-            <w:proofErr w:type="gramEnd"/>
-            <w:r>
-              <w:rPr>
-                <w:rFonts w:eastAsia="Calibri"/>
-                <w:b/>
-                <w:bCs/>
-                <w:sz w:val="22"/>
-                <w:szCs w:val="22"/>
-                <w:lang w:val="en-US"/>
-              </w:rPr>
-              <w:t>, and if so in what form?</w:t>
+              <w:t>Will participants be remunerated, and if so in what form?</w:t>
             </w:r>
           </w:p>
           <w:p>
@@ -8050,19 +8145,7 @@
                 <w:szCs w:val="22"/>
                 <w:lang w:val="en-US"/>
               </w:rPr>
-              <w:t xml:space="preserve">Justification for proposed sample size and for selecting a specific gender, age, or any </w:t>
-            </w:r>
-            <w:r>
-              <w:rPr>
-                <w:rFonts w:eastAsia="Calibri"/>
-                <w:b/>
-                <w:bCs/>
-                <w:sz w:val="22"/>
-                <w:szCs w:val="22"/>
-                <w:lang w:val="en-US"/>
-              </w:rPr>
-              <w:lastRenderedPageBreak/>
-              <w:t>other group if this is done in your research.</w:t>
+              <w:t>Justification for proposed sample size and for selecting a specific gender, age, or any other group if this is done in your research.</w:t>
             </w:r>
           </w:p>
           <w:p>
@@ -8816,31 +8899,7 @@
                 <w:szCs w:val="22"/>
                 <w:lang w:val="en-US"/>
               </w:rPr>
-              <w:t xml:space="preserve">Will you tell participants that their data will be treated with full confidentiality and that, if published, it will not be identifiable </w:t>
-            </w:r>
-            <w:proofErr w:type="gramStart"/>
-            <w:r>
-              <w:rPr>
-                <w:rFonts w:eastAsia="Calibri"/>
-                <w:b/>
-                <w:bCs/>
-                <w:sz w:val="22"/>
-                <w:szCs w:val="22"/>
-                <w:lang w:val="en-US"/>
-              </w:rPr>
-              <w:t>as</w:t>
-            </w:r>
-            <w:proofErr w:type="gramEnd"/>
-            <w:r>
-              <w:rPr>
-                <w:rFonts w:eastAsia="Calibri"/>
-                <w:b/>
-                <w:bCs/>
-                <w:sz w:val="22"/>
-                <w:szCs w:val="22"/>
-                <w:lang w:val="en-US"/>
-              </w:rPr>
-              <w:t xml:space="preserve"> theirs?</w:t>
+              <w:t>Will you tell participants that their data will be treated with full confidentiality and that, if published, it will not be identifiable as theirs?</w:t>
             </w:r>
           </w:p>
         </w:tc>
@@ -9137,7 +9196,19 @@
                 <w:szCs w:val="22"/>
                 <w:lang w:val="en-US"/>
               </w:rPr>
-              <w:t xml:space="preserve">If you answer yes, give details and justification for doing this below. </w:t>
+              <w:t xml:space="preserve">If you answer yes, give details and justification for doing this </w:t>
+            </w:r>
+            <w:r>
+              <w:rPr>
+                <w:rFonts w:eastAsia="Calibri"/>
+                <w:b/>
+                <w:bCs/>
+                <w:sz w:val="22"/>
+                <w:szCs w:val="22"/>
+                <w:lang w:val="en-US"/>
+              </w:rPr>
+              <w:lastRenderedPageBreak/>
+              <w:t xml:space="preserve">below. </w:t>
             </w:r>
           </w:p>
         </w:tc>
@@ -9371,29 +9442,7 @@
                 <w:szCs w:val="22"/>
                 <w:lang w:val="en-US"/>
               </w:rPr>
-              <w:t xml:space="preserve">Please outline your approach to ensuring the confidentiality of data (that is, that the data will only be accessible to </w:t>
-            </w:r>
-            <w:proofErr w:type="spellStart"/>
-            <w:r>
-              <w:rPr>
-                <w:rFonts w:eastAsia="Calibri"/>
-                <w:b/>
-                <w:sz w:val="22"/>
-                <w:szCs w:val="22"/>
-                <w:lang w:val="en-US"/>
-              </w:rPr>
-              <w:t>agreed</w:t>
-            </w:r>
-            <w:proofErr w:type="spellEnd"/>
-            <w:r>
-              <w:rPr>
-                <w:rFonts w:eastAsia="Calibri"/>
-                <w:b/>
-                <w:sz w:val="22"/>
-                <w:szCs w:val="22"/>
-                <w:lang w:val="en-US"/>
-              </w:rPr>
-              <w:t xml:space="preserve"> upon parties and the safeguarding mechanisms you will put in place to achieve this.) You should include details on how and where the data will be stored, and who will have access to it.</w:t>
+              <w:t>Please outline your approach to ensuring the confidentiality of data (that is, that the data will only be accessible to agreed upon parties and the safeguarding mechanisms you will put in place to achieve this.) You should include details on how and where the data will be stored, and who will have access to it.</w:t>
             </w:r>
           </w:p>
           <w:p>
@@ -9415,7 +9464,27 @@
                 <w:szCs w:val="22"/>
                 <w:lang w:val="en-US"/>
               </w:rPr>
-              <w:t>The dataset I will use in the project is publicly available online. No personal information will be stored.</w:t>
+              <w:t>The dataset I will use in the project is publicly available online</w:t>
+            </w:r>
+            <w:r>
+              <w:rPr>
+                <w:rFonts w:eastAsia="Calibri"/>
+                <w:bCs/>
+                <w:sz w:val="22"/>
+                <w:szCs w:val="22"/>
+                <w:lang w:val="en-US"/>
+              </w:rPr>
+              <w:t xml:space="preserve"> under the BSD license</w:t>
+            </w:r>
+            <w:r>
+              <w:rPr>
+                <w:rFonts w:eastAsia="Calibri"/>
+                <w:bCs/>
+                <w:sz w:val="22"/>
+                <w:szCs w:val="22"/>
+                <w:lang w:val="en-US"/>
+              </w:rPr>
+              <w:t>. No personal information will be stored.</w:t>
             </w:r>
           </w:p>
           <w:p>
@@ -9890,39 +9959,7 @@
           <w:sz w:val="22"/>
           <w:szCs w:val="22"/>
         </w:rPr>
-        <w:t xml:space="preserve"> I have </w:t>
-      </w:r>
-      <w:proofErr w:type="gramStart"/>
-      <w:r>
-        <w:rPr>
-          <w:sz w:val="22"/>
-          <w:szCs w:val="22"/>
-        </w:rPr>
-        <w:t>read</w:t>
-      </w:r>
-      <w:proofErr w:type="gramEnd"/>
-      <w:r>
-        <w:rPr>
-          <w:sz w:val="22"/>
-          <w:szCs w:val="22"/>
-        </w:rPr>
-        <w:t xml:space="preserve"> and I understand the </w:t>
-      </w:r>
-      <w:proofErr w:type="spellStart"/>
-      <w:r>
-        <w:rPr>
-          <w:sz w:val="22"/>
-          <w:szCs w:val="22"/>
-        </w:rPr>
-        <w:t>DkIT</w:t>
-      </w:r>
-      <w:proofErr w:type="spellEnd"/>
-      <w:r>
-        <w:rPr>
-          <w:sz w:val="22"/>
-          <w:szCs w:val="22"/>
-        </w:rPr>
-        <w:t xml:space="preserve"> </w:t>
+        <w:t xml:space="preserve"> I have read and I understand the DkIT </w:t>
       </w:r>
       <w:r>
         <w:rPr>
@@ -9960,7 +9997,7 @@
           <w:szCs w:val="22"/>
         </w:rPr>
       </w:pPr>
-      <w:hyperlink r:id="rId20" w:history="1">
+      <w:hyperlink r:id="rId21" w:history="1">
         <w:r>
           <w:rPr>
             <w:rStyle w:val="Hyperlink"/>
@@ -10031,7 +10068,7 @@
         </w:rPr>
         <w:pict w14:anchorId="3EC102CC">
           <v:shape id="_x0000_i1025" type="#_x0000_t75" style="width:119.4pt;height:29.4pt">
-            <v:imagedata r:id="rId21" o:title="signature"/>
+            <v:imagedata r:id="rId22" o:title="signature"/>
           </v:shape>
         </w:pict>
       </w:r>
@@ -10110,310 +10147,310 @@
           <w:sz w:val="22"/>
           <w:szCs w:val="22"/>
         </w:rPr>
+        <w:t>25</w:t>
+      </w:r>
+      <w:r>
+        <w:rPr>
+          <w:sz w:val="22"/>
+          <w:szCs w:val="22"/>
+        </w:rPr>
+        <w:t>/03/2026</w:t>
+      </w:r>
+    </w:p>
+    <w:p>
+      <w:pPr>
+        <w:ind w:right="-483"/>
+        <w:rPr>
+          <w:sz w:val="20"/>
+          <w:szCs w:val="20"/>
+        </w:rPr>
+      </w:pPr>
+      <w:r>
+        <w:rPr>
+          <w:sz w:val="20"/>
+          <w:szCs w:val="20"/>
+        </w:rPr>
+        <w:t xml:space="preserve"> (</w:t>
+      </w:r>
+      <w:r>
+        <w:rPr>
+          <w:sz w:val="20"/>
+          <w:szCs w:val="20"/>
+        </w:rPr>
+        <w:t>Researcher</w:t>
+      </w:r>
+      <w:r>
+        <w:rPr>
+          <w:sz w:val="20"/>
+          <w:szCs w:val="20"/>
+        </w:rPr>
+        <w:t>)</w:t>
+      </w:r>
+    </w:p>
+    <w:p>
+      <w:pPr>
+        <w:rPr>
+          <w:sz w:val="20"/>
+          <w:szCs w:val="20"/>
+        </w:rPr>
+      </w:pPr>
+    </w:p>
+    <w:p>
+      <w:pPr>
+        <w:rPr>
+          <w:sz w:val="20"/>
+          <w:szCs w:val="20"/>
+        </w:rPr>
+      </w:pPr>
+    </w:p>
+    <w:p>
+      <w:pPr>
+        <w:jc w:val="both"/>
+        <w:rPr>
+          <w:sz w:val="20"/>
+          <w:szCs w:val="20"/>
+        </w:rPr>
+      </w:pPr>
+      <w:r>
+        <w:rPr>
+          <w:b/>
+          <w:sz w:val="20"/>
+          <w:szCs w:val="20"/>
+        </w:rPr>
+        <w:t>Supervisor:</w:t>
+      </w:r>
+      <w:r>
+        <w:rPr>
+          <w:sz w:val="20"/>
+          <w:szCs w:val="20"/>
+        </w:rPr>
+        <w:t xml:space="preserve"> </w:t>
+      </w:r>
+      <w:r>
+        <w:rPr>
+          <w:sz w:val="20"/>
+          <w:szCs w:val="20"/>
+        </w:rPr>
+        <w:t xml:space="preserve">Applications for Ethical Approval </w:t>
+      </w:r>
+      <w:r>
+        <w:rPr>
+          <w:sz w:val="20"/>
+          <w:szCs w:val="20"/>
+        </w:rPr>
+        <w:t>of</w:t>
+      </w:r>
+      <w:r>
+        <w:rPr>
+          <w:sz w:val="20"/>
+          <w:szCs w:val="20"/>
+        </w:rPr>
+        <w:t xml:space="preserve"> Undergraduate projects are </w:t>
+      </w:r>
+      <w:r>
+        <w:rPr>
+          <w:sz w:val="20"/>
+          <w:szCs w:val="20"/>
+        </w:rPr>
+        <w:t>forwarded</w:t>
+      </w:r>
+      <w:r>
+        <w:rPr>
+          <w:sz w:val="20"/>
+          <w:szCs w:val="20"/>
+        </w:rPr>
+        <w:t xml:space="preserve"> to the Departmental Research</w:t>
+      </w:r>
+      <w:r>
+        <w:rPr>
+          <w:sz w:val="20"/>
+          <w:szCs w:val="20"/>
+        </w:rPr>
+        <w:t xml:space="preserve"> Ethics</w:t>
+      </w:r>
+      <w:r>
+        <w:rPr>
+          <w:sz w:val="20"/>
+          <w:szCs w:val="20"/>
+        </w:rPr>
+        <w:t xml:space="preserve"> Committee</w:t>
+      </w:r>
+      <w:r>
+        <w:rPr>
+          <w:sz w:val="20"/>
+          <w:szCs w:val="20"/>
+        </w:rPr>
+        <w:t xml:space="preserve"> for approval or referral to the School Research Ethics Committee</w:t>
+      </w:r>
+      <w:r>
+        <w:rPr>
+          <w:sz w:val="20"/>
+          <w:szCs w:val="20"/>
+        </w:rPr>
+        <w:t xml:space="preserve">. Applications for Ethical Approval </w:t>
+      </w:r>
+      <w:r>
+        <w:rPr>
+          <w:sz w:val="20"/>
+          <w:szCs w:val="20"/>
+        </w:rPr>
+        <w:t>of</w:t>
+      </w:r>
+      <w:r>
+        <w:rPr>
+          <w:sz w:val="20"/>
+          <w:szCs w:val="20"/>
+        </w:rPr>
+        <w:t xml:space="preserve"> Post</w:t>
+      </w:r>
+      <w:r>
+        <w:rPr>
+          <w:sz w:val="20"/>
+          <w:szCs w:val="20"/>
+        </w:rPr>
+        <w:t>graduate and Staff projects are sent to the School Research Ethics Committee for Approval.</w:t>
+      </w:r>
+    </w:p>
+    <w:p>
+      <w:pPr>
+        <w:jc w:val="both"/>
+        <w:rPr>
+          <w:sz w:val="20"/>
+          <w:szCs w:val="20"/>
+        </w:rPr>
+      </w:pPr>
+    </w:p>
+    <w:p>
+      <w:pPr>
+        <w:jc w:val="both"/>
+        <w:rPr>
+          <w:sz w:val="20"/>
+          <w:szCs w:val="20"/>
+        </w:rPr>
+      </w:pPr>
+      <w:r>
+        <w:rPr>
+          <w:sz w:val="20"/>
+          <w:szCs w:val="20"/>
+        </w:rPr>
+        <w:t>I have read and approved th</w:t>
+      </w:r>
+      <w:r>
+        <w:rPr>
+          <w:sz w:val="20"/>
+          <w:szCs w:val="20"/>
+        </w:rPr>
+        <w:t>is form</w:t>
+      </w:r>
+      <w:r>
+        <w:rPr>
+          <w:sz w:val="20"/>
+          <w:szCs w:val="20"/>
+        </w:rPr>
+        <w:t xml:space="preserve"> &amp; information:</w:t>
+      </w:r>
+    </w:p>
+    <w:p>
+      <w:pPr>
+        <w:rPr>
+          <w:sz w:val="20"/>
+          <w:szCs w:val="20"/>
+        </w:rPr>
+      </w:pPr>
+    </w:p>
+    <w:p>
+      <w:pPr>
+        <w:rPr>
+          <w:sz w:val="20"/>
+          <w:szCs w:val="20"/>
+        </w:rPr>
+      </w:pPr>
+    </w:p>
+    <w:p>
+      <w:pPr>
+        <w:rPr>
+          <w:sz w:val="20"/>
+          <w:szCs w:val="20"/>
+        </w:rPr>
+      </w:pPr>
+    </w:p>
+    <w:p>
+      <w:pPr>
+        <w:ind w:right="-483"/>
+        <w:rPr>
+          <w:sz w:val="20"/>
+          <w:szCs w:val="20"/>
+        </w:rPr>
+      </w:pPr>
+      <w:r>
+        <w:rPr>
+          <w:sz w:val="20"/>
+          <w:szCs w:val="20"/>
+        </w:rPr>
+        <w:t>Signed:</w:t>
+      </w:r>
+      <w:r>
+        <w:rPr>
+          <w:sz w:val="20"/>
+          <w:szCs w:val="20"/>
+        </w:rPr>
+        <w:t xml:space="preserve"> </w:t>
+      </w:r>
+      <w:r>
+        <w:rPr>
+          <w:sz w:val="22"/>
+          <w:szCs w:val="22"/>
+        </w:rPr>
+        <w:t>S Moore</w:t>
+      </w:r>
+      <w:r>
+        <w:rPr>
+          <w:sz w:val="22"/>
+          <w:szCs w:val="22"/>
+        </w:rPr>
+        <w:tab/>
+      </w:r>
+      <w:r>
+        <w:rPr>
+          <w:sz w:val="20"/>
+          <w:szCs w:val="20"/>
+        </w:rPr>
+        <w:t xml:space="preserve">Print Name: </w:t>
+      </w:r>
+      <w:r>
+        <w:rPr>
+          <w:sz w:val="22"/>
+          <w:szCs w:val="22"/>
+        </w:rPr>
+        <w:t>DR SAMUEL MOORE</w:t>
+      </w:r>
+      <w:r>
+        <w:rPr>
+          <w:sz w:val="22"/>
+          <w:szCs w:val="22"/>
+        </w:rPr>
+        <w:tab/>
+      </w:r>
+      <w:r>
+        <w:rPr>
+          <w:sz w:val="22"/>
+          <w:szCs w:val="22"/>
+        </w:rPr>
+        <w:tab/>
+      </w:r>
+      <w:r>
+        <w:rPr>
+          <w:sz w:val="20"/>
+          <w:szCs w:val="20"/>
+        </w:rPr>
+        <w:t xml:space="preserve">Date: </w:t>
+      </w:r>
+      <w:r>
+        <w:rPr>
+          <w:sz w:val="22"/>
+          <w:szCs w:val="22"/>
+        </w:rPr>
         <w:t>19/03/2026</w:t>
-      </w:r>
-    </w:p>
-    <w:p>
-      <w:pPr>
-        <w:ind w:right="-483"/>
-        <w:rPr>
-          <w:sz w:val="20"/>
-          <w:szCs w:val="20"/>
-        </w:rPr>
-      </w:pPr>
-      <w:r>
-        <w:rPr>
-          <w:sz w:val="20"/>
-          <w:szCs w:val="20"/>
-        </w:rPr>
-        <w:t xml:space="preserve"> (</w:t>
-      </w:r>
-      <w:r>
-        <w:rPr>
-          <w:sz w:val="20"/>
-          <w:szCs w:val="20"/>
-        </w:rPr>
-        <w:t>Researcher</w:t>
-      </w:r>
-      <w:r>
-        <w:rPr>
-          <w:sz w:val="20"/>
-          <w:szCs w:val="20"/>
-        </w:rPr>
-        <w:t>)</w:t>
-      </w:r>
-    </w:p>
-    <w:p>
-      <w:pPr>
-        <w:rPr>
-          <w:sz w:val="20"/>
-          <w:szCs w:val="20"/>
-        </w:rPr>
-      </w:pPr>
-    </w:p>
-    <w:p>
-      <w:pPr>
-        <w:rPr>
-          <w:sz w:val="20"/>
-          <w:szCs w:val="20"/>
-        </w:rPr>
-      </w:pPr>
-    </w:p>
-    <w:p>
-      <w:pPr>
-        <w:jc w:val="both"/>
-        <w:rPr>
-          <w:sz w:val="20"/>
-          <w:szCs w:val="20"/>
-        </w:rPr>
-      </w:pPr>
-      <w:r>
-        <w:rPr>
-          <w:b/>
-          <w:sz w:val="20"/>
-          <w:szCs w:val="20"/>
-        </w:rPr>
-        <w:t>Supervisor:</w:t>
-      </w:r>
-      <w:r>
-        <w:rPr>
-          <w:sz w:val="20"/>
-          <w:szCs w:val="20"/>
-        </w:rPr>
-        <w:t xml:space="preserve"> </w:t>
-      </w:r>
-      <w:r>
-        <w:rPr>
-          <w:sz w:val="20"/>
-          <w:szCs w:val="20"/>
-        </w:rPr>
-        <w:t xml:space="preserve">Applications for Ethical Approval </w:t>
-      </w:r>
-      <w:r>
-        <w:rPr>
-          <w:sz w:val="20"/>
-          <w:szCs w:val="20"/>
-        </w:rPr>
-        <w:t>of</w:t>
-      </w:r>
-      <w:r>
-        <w:rPr>
-          <w:sz w:val="20"/>
-          <w:szCs w:val="20"/>
-        </w:rPr>
-        <w:t xml:space="preserve"> Undergraduate projects are </w:t>
-      </w:r>
-      <w:r>
-        <w:rPr>
-          <w:sz w:val="20"/>
-          <w:szCs w:val="20"/>
-        </w:rPr>
-        <w:t>forwarded</w:t>
-      </w:r>
-      <w:r>
-        <w:rPr>
-          <w:sz w:val="20"/>
-          <w:szCs w:val="20"/>
-        </w:rPr>
-        <w:t xml:space="preserve"> to the Departmental Research</w:t>
-      </w:r>
-      <w:r>
-        <w:rPr>
-          <w:sz w:val="20"/>
-          <w:szCs w:val="20"/>
-        </w:rPr>
-        <w:t xml:space="preserve"> Ethics</w:t>
-      </w:r>
-      <w:r>
-        <w:rPr>
-          <w:sz w:val="20"/>
-          <w:szCs w:val="20"/>
-        </w:rPr>
-        <w:t xml:space="preserve"> Committee</w:t>
-      </w:r>
-      <w:r>
-        <w:rPr>
-          <w:sz w:val="20"/>
-          <w:szCs w:val="20"/>
-        </w:rPr>
-        <w:t xml:space="preserve"> for approval or referral to the School Research Ethics Committee</w:t>
-      </w:r>
-      <w:r>
-        <w:rPr>
-          <w:sz w:val="20"/>
-          <w:szCs w:val="20"/>
-        </w:rPr>
-        <w:t xml:space="preserve">. Applications for Ethical Approval </w:t>
-      </w:r>
-      <w:r>
-        <w:rPr>
-          <w:sz w:val="20"/>
-          <w:szCs w:val="20"/>
-        </w:rPr>
-        <w:t>of</w:t>
-      </w:r>
-      <w:r>
-        <w:rPr>
-          <w:sz w:val="20"/>
-          <w:szCs w:val="20"/>
-        </w:rPr>
-        <w:t xml:space="preserve"> Post</w:t>
-      </w:r>
-      <w:r>
-        <w:rPr>
-          <w:sz w:val="20"/>
-          <w:szCs w:val="20"/>
-        </w:rPr>
-        <w:t>graduate and Staff projects are sent to the School Research Ethics Committee for Approval.</w:t>
-      </w:r>
-    </w:p>
-    <w:p>
-      <w:pPr>
-        <w:jc w:val="both"/>
-        <w:rPr>
-          <w:sz w:val="20"/>
-          <w:szCs w:val="20"/>
-        </w:rPr>
-      </w:pPr>
-    </w:p>
-    <w:p>
-      <w:pPr>
-        <w:jc w:val="both"/>
-        <w:rPr>
-          <w:sz w:val="20"/>
-          <w:szCs w:val="20"/>
-        </w:rPr>
-      </w:pPr>
-      <w:r>
-        <w:rPr>
-          <w:sz w:val="20"/>
-          <w:szCs w:val="20"/>
-        </w:rPr>
-        <w:t>I have read and approved th</w:t>
-      </w:r>
-      <w:r>
-        <w:rPr>
-          <w:sz w:val="20"/>
-          <w:szCs w:val="20"/>
-        </w:rPr>
-        <w:t>is form</w:t>
-      </w:r>
-      <w:r>
-        <w:rPr>
-          <w:sz w:val="20"/>
-          <w:szCs w:val="20"/>
-        </w:rPr>
-        <w:t xml:space="preserve"> &amp; information:</w:t>
-      </w:r>
-    </w:p>
-    <w:p>
-      <w:pPr>
-        <w:rPr>
-          <w:sz w:val="20"/>
-          <w:szCs w:val="20"/>
-        </w:rPr>
-      </w:pPr>
-    </w:p>
-    <w:p>
-      <w:pPr>
-        <w:rPr>
-          <w:sz w:val="20"/>
-          <w:szCs w:val="20"/>
-        </w:rPr>
-      </w:pPr>
-    </w:p>
-    <w:p>
-      <w:pPr>
-        <w:rPr>
-          <w:sz w:val="20"/>
-          <w:szCs w:val="20"/>
-        </w:rPr>
-      </w:pPr>
-    </w:p>
-    <w:p>
-      <w:pPr>
-        <w:ind w:right="-483"/>
-        <w:rPr>
-          <w:sz w:val="20"/>
-          <w:szCs w:val="20"/>
-        </w:rPr>
-      </w:pPr>
-      <w:r>
-        <w:rPr>
-          <w:sz w:val="20"/>
-          <w:szCs w:val="20"/>
-        </w:rPr>
-        <w:t>Signed</w:t>
-      </w:r>
-      <w:r>
-        <w:rPr>
-          <w:sz w:val="20"/>
-          <w:szCs w:val="20"/>
-        </w:rPr>
-        <w:t xml:space="preserve">: </w:t>
-      </w:r>
-      <w:r>
-        <w:rPr>
-          <w:sz w:val="22"/>
-          <w:szCs w:val="22"/>
-        </w:rPr>
-        <w:t>_______________________</w:t>
-      </w:r>
-      <w:r>
-        <w:rPr>
-          <w:sz w:val="22"/>
-          <w:szCs w:val="22"/>
-        </w:rPr>
-        <w:t xml:space="preserve"> </w:t>
-      </w:r>
-      <w:r>
-        <w:rPr>
-          <w:sz w:val="20"/>
-          <w:szCs w:val="20"/>
-        </w:rPr>
-        <w:t>Print Name</w:t>
-      </w:r>
-      <w:r>
-        <w:rPr>
-          <w:sz w:val="20"/>
-          <w:szCs w:val="20"/>
-        </w:rPr>
-        <w:t xml:space="preserve">: </w:t>
-      </w:r>
-      <w:r>
-        <w:rPr>
-          <w:sz w:val="22"/>
-          <w:szCs w:val="22"/>
-        </w:rPr>
-        <w:t>_______________________</w:t>
-      </w:r>
-      <w:r>
-        <w:rPr>
-          <w:sz w:val="22"/>
-          <w:szCs w:val="22"/>
-        </w:rPr>
-        <w:t xml:space="preserve"> </w:t>
-      </w:r>
-      <w:r>
-        <w:rPr>
-          <w:sz w:val="20"/>
-          <w:szCs w:val="20"/>
-        </w:rPr>
-        <w:t>Date</w:t>
-      </w:r>
-      <w:r>
-        <w:rPr>
-          <w:sz w:val="20"/>
-          <w:szCs w:val="20"/>
-        </w:rPr>
-        <w:t xml:space="preserve">: </w:t>
-      </w:r>
-      <w:r>
-        <w:rPr>
-          <w:sz w:val="22"/>
-          <w:szCs w:val="22"/>
-        </w:rPr>
-        <w:t>__________</w:t>
       </w:r>
     </w:p>
     <w:p>
@@ -10760,7 +10797,7 @@
           <w:lang w:val="en-IE" w:eastAsia="en-IE"/>
         </w:rPr>
         <w:pict w14:anchorId="7E0683E2">
-          <v:shape id="_x0000_s2063" type="#_x0000_t202" style="position:absolute;margin-left:417.6pt;margin-top:9.75pt;width:17pt;height:17pt;z-index:2;mso-wrap-edited:f">
+          <v:shape id="_x0000_s2063" type="#_x0000_t202" style="position:absolute;margin-left:417.6pt;margin-top:9.75pt;width:17pt;height:17pt;z-index:251658241;mso-wrap-edited:f">
             <v:textbox style="mso-next-textbox:#_x0000_s2063">
               <w:txbxContent>
                 <w:p/>
@@ -10808,7 +10845,7 @@
           <w:lang w:val="en-IE" w:eastAsia="en-IE"/>
         </w:rPr>
         <w:pict w14:anchorId="5AFE7CAE">
-          <v:shape id="_x0000_s2062" type="#_x0000_t202" style="position:absolute;margin-left:417.6pt;margin-top:8.85pt;width:17pt;height:17pt;z-index:3;mso-wrap-edited:f">
+          <v:shape id="_x0000_s2062" type="#_x0000_t202" style="position:absolute;margin-left:417.6pt;margin-top:8.85pt;width:17pt;height:17pt;z-index:251658242;mso-wrap-edited:f">
             <v:textbox style="mso-next-textbox:#_x0000_s2062">
               <w:txbxContent>
                 <w:p/>
@@ -11148,7 +11185,7 @@
           <w:lang w:val="en-IE" w:eastAsia="en-IE"/>
         </w:rPr>
         <w:pict w14:anchorId="7001F84C">
-          <v:shape id="_x0000_s2061" type="#_x0000_t202" style="position:absolute;margin-left:417.6pt;margin-top:9.75pt;width:17pt;height:17pt;z-index:9;mso-wrap-edited:f">
+          <v:shape id="_x0000_s2061" type="#_x0000_t202" style="position:absolute;margin-left:417.6pt;margin-top:9.75pt;width:17pt;height:17pt;z-index:251658248;mso-wrap-edited:f">
             <v:textbox style="mso-next-textbox:#_x0000_s2061">
               <w:txbxContent>
                 <w:p/>
@@ -11196,7 +11233,7 @@
           <w:lang w:val="en-IE" w:eastAsia="en-IE"/>
         </w:rPr>
         <w:pict w14:anchorId="169F7AB1">
-          <v:shape id="_x0000_s2060" type="#_x0000_t202" style="position:absolute;margin-left:417.6pt;margin-top:8.85pt;width:17pt;height:17pt;z-index:10;mso-wrap-edited:f">
+          <v:shape id="_x0000_s2060" type="#_x0000_t202" style="position:absolute;margin-left:417.6pt;margin-top:8.85pt;width:17pt;height:17pt;z-index:251658249;mso-wrap-edited:f">
             <v:textbox style="mso-next-textbox:#_x0000_s2060">
               <w:txbxContent>
                 <w:p/>
@@ -11589,14 +11626,7 @@
     </w:r>
     <w:r>
       <w:tab/>
-    </w:r>
-    <w:proofErr w:type="spellStart"/>
-    <w:r>
-      <w:t>Leathanach</w:t>
-    </w:r>
-    <w:proofErr w:type="spellEnd"/>
-    <w:r>
-      <w:t xml:space="preserve"> - Page</w:t>
+      <w:t>Leathanach - Page</w:t>
     </w:r>
   </w:p>
 </w:ftr>
@@ -13457,7 +13487,6 @@
   <w:style w:type="character" w:default="1" w:styleId="DefaultParagraphFont">
     <w:name w:val="Default Paragraph Font"/>
     <w:uiPriority w:val="1"/>
-    <w:semiHidden/>
     <w:unhideWhenUsed/>
   </w:style>
   <w:style w:type="table" w:default="1" w:styleId="TableNormal">
@@ -13704,6 +13733,19 @@
     <w:name w:val="page number"/>
     <w:basedOn w:val="DefaultParagraphFont"/>
     <w:rsid w:val="00893F32"/>
+  </w:style>
+  <w:style w:type="paragraph" w:styleId="Revision">
+    <w:name w:val="Revision"/>
+    <w:hidden/>
+    <w:uiPriority w:val="99"/>
+    <w:semiHidden/>
+    <w:rsid w:val="00730AA9"/>
+    <w:rPr>
+      <w:rFonts w:ascii="Arial" w:hAnsi="Arial" w:cs="Arial"/>
+      <w:sz w:val="24"/>
+      <w:szCs w:val="24"/>
+      <w:lang w:val="en-GB" w:eastAsia="zh-CN"/>
+    </w:rPr>
   </w:style>
 </w:styles>
 </file>

</xml_diff>